<commit_message>
(fix): Task 1 Sprint 3 - added missing changes
</commit_message>
<xml_diff>
--- a/power_bi/business_background.docx
+++ b/power_bi/business_background.docx
@@ -4,24 +4,13 @@
   <w:body>
     <w:p>
       <w:pPr>
-        <w:pStyle w:val="BodyText"/>
-        <w:rPr>
-          <w:rFonts w:ascii="Arial" w:hAnsi="Arial" w:cs="Arial"/>
-        </w:rPr>
-      </w:pPr>
-      <w:r>
-        <w:rPr>
-          <w:rFonts w:ascii="Arial" w:hAnsi="Arial" w:cs="Arial"/>
-        </w:rPr>
-        <w:t>Description should be approximately 1 page.</w:t>
-      </w:r>
-    </w:p>
-    <w:p>
-      <w:pPr>
         <w:pStyle w:val="Heading1"/>
       </w:pPr>
       <w:r>
-        <w:t>BUSINESS BACKGROUND</w:t>
+        <w:t>B</w:t>
+      </w:r>
+      <w:r>
+        <w:t>USINESS BACKGROUND</w:t>
       </w:r>
     </w:p>
     <w:p>
@@ -34,67 +23,204 @@
       </w:pPr>
       <w:r>
         <w:rPr>
-          <w:rFonts w:ascii="Arial" w:hAnsi="Arial" w:cs="Arial"/>
+          <w:noProof/>
         </w:rPr>
+        <w:drawing>
+          <wp:inline distT="0" distB="0" distL="0" distR="0" wp14:anchorId="189CEF1D" wp14:editId="01A106A0">
+            <wp:extent cx="781050" cy="781050"/>
+            <wp:effectExtent l="0" t="0" r="0" b="0"/>
+            <wp:docPr id="1093516804" name="Picture 12"/>
+            <wp:cNvGraphicFramePr>
+              <a:graphicFrameLocks xmlns:a="http://schemas.openxmlformats.org/drawingml/2006/main" noChangeAspect="1"/>
+            </wp:cNvGraphicFramePr>
+            <a:graphic xmlns:a="http://schemas.openxmlformats.org/drawingml/2006/main">
+              <a:graphicData uri="http://schemas.openxmlformats.org/drawingml/2006/picture">
+                <pic:pic xmlns:pic="http://schemas.openxmlformats.org/drawingml/2006/picture">
+                  <pic:nvPicPr>
+                    <pic:cNvPr id="0" name="Picture 17"/>
+                    <pic:cNvPicPr>
+                      <a:picLocks noChangeAspect="1" noChangeArrowheads="1"/>
+                    </pic:cNvPicPr>
+                  </pic:nvPicPr>
+                  <pic:blipFill>
+                    <a:blip r:embed="rId10" cstate="print">
+                      <a:extLst>
+                        <a:ext uri="{28A0092B-C50C-407E-A947-70E740481C1C}">
+                          <a14:useLocalDpi xmlns:a14="http://schemas.microsoft.com/office/drawing/2010/main" val="0"/>
+                        </a:ext>
+                      </a:extLst>
+                    </a:blip>
+                    <a:srcRect/>
+                    <a:stretch>
+                      <a:fillRect/>
+                    </a:stretch>
+                  </pic:blipFill>
+                  <pic:spPr bwMode="auto">
+                    <a:xfrm>
+                      <a:off x="0" y="0"/>
+                      <a:ext cx="781050" cy="781050"/>
+                    </a:xfrm>
+                    <a:prstGeom prst="rect">
+                      <a:avLst/>
+                    </a:prstGeom>
+                    <a:noFill/>
+                    <a:ln>
+                      <a:noFill/>
+                    </a:ln>
+                  </pic:spPr>
+                </pic:pic>
+              </a:graphicData>
+            </a:graphic>
+          </wp:inline>
+        </w:drawing>
+      </w:r>
+    </w:p>
+    <w:p>
+      <w:pPr>
+        <w:pStyle w:val="BodyText"/>
+      </w:pPr>
+      <w:r>
         <w:t>WATSON’s</w:t>
       </w:r>
       <w:r>
+        <w:t xml:space="preserve"> – the clothes shop</w:t>
+      </w:r>
+    </w:p>
+    <w:p>
+      <w:pPr>
+        <w:pStyle w:val="BodyText"/>
         <w:rPr>
-          <w:rFonts w:ascii="Arial" w:hAnsi="Arial" w:cs="Arial"/>
-        </w:rPr>
-        <w:t xml:space="preserve"> </w:t>
-      </w:r>
-      <w:r>
-        <w:rPr>
-          <w:rFonts w:ascii="Arial" w:hAnsi="Arial" w:cs="Arial"/>
           <w:color w:val="FF0000"/>
         </w:rPr>
-        <w:t>+ logo</w:t>
+      </w:pPr>
+      <w:r>
+        <w:t>Is a</w:t>
+      </w:r>
+      <w:r>
+        <w:t xml:space="preserve"> clothing company that specializes in both </w:t>
+      </w:r>
+      <w:proofErr w:type="gramStart"/>
+      <w:r>
+        <w:t>retails</w:t>
+      </w:r>
+      <w:proofErr w:type="gramEnd"/>
+      <w:r>
+        <w:t xml:space="preserve"> </w:t>
+      </w:r>
+      <w:r>
+        <w:t>and e-commerce clothing sales (tops, bottoms, shoes, accessories), operating through physical stores and an online e-shop.</w:t>
       </w:r>
     </w:p>
     <w:p>
       <w:pPr>
-        <w:widowControl/>
-        <w:spacing w:after="160" w:line="256" w:lineRule="auto"/>
-        <w:rPr>
-          <w:rFonts w:ascii="Arial" w:hAnsi="Arial" w:cs="Arial"/>
-          <w:color w:val="FF0000"/>
-        </w:rPr>
-      </w:pPr>
-      <w:r>
-        <w:rPr>
-          <w:rFonts w:ascii="Arial" w:hAnsi="Arial" w:cs="Arial"/>
-        </w:rPr>
-        <w:t>A clothing company that specializes in both e-commerce and retail sales of variety of articles of clothing. It is located in the United States and works on national scale</w:t>
-      </w:r>
-      <w:r>
-        <w:rPr>
-          <w:rFonts w:ascii="Arial" w:hAnsi="Arial" w:cs="Arial"/>
-        </w:rPr>
-        <w:t xml:space="preserve">. </w:t>
-      </w:r>
-      <w:r>
-        <w:rPr>
-          <w:rFonts w:ascii="Arial" w:hAnsi="Arial" w:cs="Arial"/>
-          <w:color w:val="FF0000"/>
-        </w:rPr>
-        <w:t>+</w:t>
-      </w:r>
-      <w:r>
-        <w:rPr>
-          <w:rFonts w:ascii="Arial" w:hAnsi="Arial" w:cs="Arial"/>
-          <w:color w:val="FF0000"/>
-        </w:rPr>
-        <w:t>come up with the name of the company, logo, field of activity;</w:t>
+        <w:pStyle w:val="Heading2"/>
+        <w:ind w:left="720"/>
+      </w:pPr>
+      <w:r>
+        <w:t>Purpose of the report</w:t>
       </w:r>
     </w:p>
     <w:p>
       <w:pPr>
+        <w:pStyle w:val="BodyText"/>
+      </w:pPr>
+      <w:r>
+        <w:t xml:space="preserve">The report </w:t>
+      </w:r>
+      <w:proofErr w:type="gramStart"/>
+      <w:r>
+        <w:t>analyzes</w:t>
+      </w:r>
+      <w:proofErr w:type="gramEnd"/>
+      <w:r>
+        <w:t xml:space="preserve"> the end-</w:t>
+      </w:r>
+      <w:proofErr w:type="gramStart"/>
+      <w:r>
+        <w:t>to-</w:t>
+      </w:r>
+      <w:proofErr w:type="gramEnd"/>
+      <w:r>
+        <w:t xml:space="preserve">end sales process across both distribution channels </w:t>
+      </w:r>
+      <w:r>
+        <w:t>-</w:t>
+      </w:r>
+      <w:r>
+        <w:t xml:space="preserve"> retail (physical stores) and e-commerce. It covers product performance, revenue and profitability, seasonal demand patterns typical for the apparel industry, employee and store performance, payment method usage, and customer purchasing behavior.</w:t>
+      </w:r>
+    </w:p>
+    <w:p>
+      <w:pPr>
+        <w:pStyle w:val="BodyText"/>
+      </w:pPr>
+      <w:r>
+        <w:t>Its purpose is to</w:t>
+      </w:r>
+      <w:r>
+        <w:t xml:space="preserve"> give management a fast, self-service way to </w:t>
+      </w:r>
+      <w:r>
+        <w:t>assess the state of current business state</w:t>
+      </w:r>
+      <w:r>
+        <w:t xml:space="preserve"> from an executive level down to product/category, channel, store, employee, and customer level, without requiring manual data pulls or SQL queries against the data warehouse.</w:t>
+      </w:r>
+    </w:p>
+    <w:p>
+      <w:pPr>
         <w:pStyle w:val="Heading2"/>
         <w:ind w:left="720"/>
       </w:pPr>
       <w:r>
-        <w:t>Purpose of the report</w:t>
+        <w:t>end user</w:t>
+      </w:r>
+    </w:p>
+    <w:p>
+      <w:pPr>
+        <w:pStyle w:val="BodyText"/>
+      </w:pPr>
+      <w:r>
+        <w:t>End users include s</w:t>
+      </w:r>
+      <w:r>
+        <w:t>ales and operations managers, category/merchandising managers, regional store managers, and executive stakeholders who need recurring insight into sales performance, margin, and seasonality.</w:t>
+      </w:r>
+    </w:p>
+    <w:p>
+      <w:pPr>
+        <w:pStyle w:val="Heading2"/>
+        <w:ind w:left="720"/>
+      </w:pPr>
+      <w:r>
+        <w:t>B</w:t>
+      </w:r>
+      <w:r>
+        <w:t>usiness questions and problems</w:t>
+      </w:r>
+    </w:p>
+    <w:p>
+      <w:pPr>
+        <w:pStyle w:val="BodyText"/>
+      </w:pPr>
+      <w:r>
+        <w:t xml:space="preserve">This report has insights and </w:t>
+      </w:r>
+      <w:proofErr w:type="gramStart"/>
+      <w:r>
+        <w:t>collected</w:t>
+      </w:r>
+      <w:proofErr w:type="gramEnd"/>
+      <w:r>
+        <w:t xml:space="preserve"> information that </w:t>
+      </w:r>
+      <w:proofErr w:type="gramStart"/>
+      <w:r>
+        <w:t>help</w:t>
+      </w:r>
+      <w:proofErr w:type="gramEnd"/>
+      <w:r>
+        <w:t xml:space="preserve"> in answering questions such as:</w:t>
       </w:r>
     </w:p>
     <w:p>
@@ -102,30 +228,25 @@
         <w:pStyle w:val="BodyText"/>
         <w:numPr>
           <w:ilvl w:val="0"/>
-          <w:numId w:val="31"/>
+          <w:numId w:val="37"/>
         </w:numPr>
-        <w:spacing w:before="0"/>
-        <w:rPr>
-          <w:rFonts w:ascii="Arial" w:hAnsi="Arial" w:cs="Arial"/>
-        </w:rPr>
-      </w:pPr>
-      <w:r>
-        <w:rPr>
-          <w:rFonts w:ascii="Arial" w:hAnsi="Arial" w:cs="Arial"/>
-        </w:rPr>
-        <w:t>d</w:t>
-      </w:r>
-      <w:r>
-        <w:rPr>
-          <w:rFonts w:ascii="Arial" w:hAnsi="Arial" w:cs="Arial"/>
-        </w:rPr>
-        <w:t>escribe the business process you want to expose and analyze in your report</w:t>
-      </w:r>
-      <w:r>
-        <w:rPr>
-          <w:rFonts w:ascii="Arial" w:hAnsi="Arial" w:cs="Arial"/>
-        </w:rPr>
-        <w:t>;</w:t>
+      </w:pPr>
+      <w:r>
+        <w:t xml:space="preserve">How is total revenue and profit margin trending, and how does it compare to </w:t>
+      </w:r>
+      <w:proofErr w:type="gramStart"/>
+      <w:r>
+        <w:t xml:space="preserve">the </w:t>
+      </w:r>
+      <w:r>
+        <w:t>past</w:t>
+      </w:r>
+      <w:proofErr w:type="gramEnd"/>
+      <w:r>
+        <w:t xml:space="preserve"> performance</w:t>
+      </w:r>
+      <w:r>
+        <w:t>?</w:t>
       </w:r>
     </w:p>
     <w:p>
@@ -133,60 +254,11 @@
         <w:pStyle w:val="BodyText"/>
         <w:numPr>
           <w:ilvl w:val="0"/>
-          <w:numId w:val="31"/>
+          <w:numId w:val="37"/>
         </w:numPr>
-        <w:spacing w:before="0"/>
-        <w:rPr>
-          <w:rFonts w:ascii="Arial" w:hAnsi="Arial" w:cs="Arial"/>
-        </w:rPr>
-      </w:pPr>
-      <w:r>
-        <w:rPr>
-          <w:rFonts w:ascii="Arial" w:hAnsi="Arial" w:cs="Arial"/>
-        </w:rPr>
-        <w:t>formulate</w:t>
-      </w:r>
-      <w:r>
-        <w:rPr>
-          <w:rFonts w:ascii="Arial" w:hAnsi="Arial" w:cs="Arial"/>
-        </w:rPr>
-        <w:t xml:space="preserve"> the purpose of </w:t>
-      </w:r>
-      <w:r>
-        <w:rPr>
-          <w:rFonts w:ascii="Arial" w:hAnsi="Arial" w:cs="Arial"/>
-        </w:rPr>
-        <w:t>the</w:t>
-      </w:r>
-      <w:r>
-        <w:rPr>
-          <w:rFonts w:ascii="Arial" w:hAnsi="Arial" w:cs="Arial"/>
-        </w:rPr>
-        <w:t xml:space="preserve"> report</w:t>
-      </w:r>
-      <w:r>
-        <w:rPr>
-          <w:rFonts w:ascii="Arial" w:hAnsi="Arial" w:cs="Arial"/>
-        </w:rPr>
-        <w:t>;</w:t>
-      </w:r>
-    </w:p>
-    <w:p>
-      <w:pPr>
-        <w:pStyle w:val="BodyText"/>
-        <w:spacing w:before="0"/>
-        <w:rPr>
-          <w:rFonts w:ascii="Arial" w:hAnsi="Arial" w:cs="Arial"/>
-        </w:rPr>
-      </w:pPr>
-    </w:p>
-    <w:p>
-      <w:pPr>
-        <w:pStyle w:val="Heading2"/>
-        <w:ind w:left="720"/>
-      </w:pPr>
-      <w:r>
-        <w:t>end user</w:t>
+      </w:pPr>
+      <w:r>
+        <w:t>Which product categories/subcategories are the strongest and weakest performers in terms of sales volume and margin?</w:t>
       </w:r>
     </w:p>
     <w:p>
@@ -194,45 +266,17 @@
         <w:pStyle w:val="BodyText"/>
         <w:numPr>
           <w:ilvl w:val="0"/>
-          <w:numId w:val="31"/>
+          <w:numId w:val="37"/>
         </w:numPr>
-        <w:spacing w:before="0"/>
-        <w:rPr>
-          <w:rFonts w:ascii="Arial" w:hAnsi="Arial" w:cs="Arial"/>
-        </w:rPr>
-      </w:pPr>
-      <w:r>
-        <w:rPr>
-          <w:rFonts w:ascii="Arial" w:hAnsi="Arial" w:cs="Arial"/>
-        </w:rPr>
-        <w:t>identify the end user of the report</w:t>
-      </w:r>
-      <w:r>
-        <w:rPr>
-          <w:rFonts w:ascii="Arial" w:hAnsi="Arial" w:cs="Arial"/>
-        </w:rPr>
-        <w:t>;</w:t>
-      </w:r>
-    </w:p>
-    <w:p>
-      <w:pPr>
-        <w:pStyle w:val="BodyText"/>
-        <w:spacing w:before="0"/>
-        <w:rPr>
-          <w:rFonts w:ascii="Arial" w:hAnsi="Arial" w:cs="Arial"/>
-        </w:rPr>
-      </w:pPr>
-    </w:p>
-    <w:p>
-      <w:pPr>
-        <w:pStyle w:val="Heading2"/>
-        <w:ind w:left="720"/>
-      </w:pPr>
-      <w:r>
-        <w:t>B</w:t>
-      </w:r>
-      <w:r>
-        <w:t>usiness questions and problems</w:t>
+      </w:pPr>
+      <w:r>
+        <w:t xml:space="preserve">How does demand vary by season (spring/summer/autumn/winter) </w:t>
+      </w:r>
+      <w:r>
+        <w:t>-</w:t>
+      </w:r>
+      <w:r>
+        <w:t xml:space="preserve"> critical for apparel collection planning?</w:t>
       </w:r>
     </w:p>
     <w:p>
@@ -240,50 +284,47 @@
         <w:pStyle w:val="BodyText"/>
         <w:numPr>
           <w:ilvl w:val="0"/>
-          <w:numId w:val="31"/>
+          <w:numId w:val="37"/>
         </w:numPr>
-        <w:spacing w:before="0"/>
-        <w:rPr>
-          <w:rFonts w:ascii="Arial" w:hAnsi="Arial" w:cs="Arial"/>
-        </w:rPr>
-      </w:pPr>
-      <w:r>
-        <w:rPr>
-          <w:rFonts w:ascii="Arial" w:hAnsi="Arial" w:cs="Arial"/>
-        </w:rPr>
-        <w:t>provide the description of the business questions and business problems that the report helps to resolve.</w:t>
-      </w:r>
-      <w:r>
-        <w:rPr>
-          <w:rFonts w:ascii="Arial" w:hAnsi="Arial" w:cs="Arial"/>
-        </w:rPr>
-        <w:t xml:space="preserve"> </w:t>
+      </w:pPr>
+      <w:r>
+        <w:t>How does the retail channel compare to e-commerce in terms of contribution to revenue?</w:t>
       </w:r>
     </w:p>
     <w:p>
       <w:pPr>
-        <w:widowControl/>
-        <w:spacing w:after="160" w:line="259" w:lineRule="auto"/>
-        <w:rPr>
-          <w:rFonts w:ascii="Trebuchet MS" w:hAnsi="Trebuchet MS"/>
-          <w:color w:val="464547"/>
-        </w:rPr>
-      </w:pPr>
-      <w:r>
-        <w:br w:type="page"/>
+        <w:pStyle w:val="BodyText"/>
+        <w:numPr>
+          <w:ilvl w:val="0"/>
+          <w:numId w:val="37"/>
+        </w:numPr>
+      </w:pPr>
+      <w:r>
+        <w:t>Which stores/zones and which employees are top performers?</w:t>
       </w:r>
     </w:p>
     <w:p>
       <w:pPr>
         <w:pStyle w:val="BodyText"/>
-      </w:pPr>
+        <w:numPr>
+          <w:ilvl w:val="0"/>
+          <w:numId w:val="37"/>
+        </w:numPr>
+      </w:pPr>
+      <w:r>
+        <w:t>What payment methods are most used, and how does customer demographic profile (gender) relate to purchasing patterns?</w:t>
+      </w:r>
     </w:p>
     <w:p>
       <w:pPr>
-        <w:pStyle w:val="Heading1"/>
-      </w:pPr>
-      <w:r>
-        <w:t>Report creation process</w:t>
+        <w:pStyle w:val="BodyText"/>
+        <w:numPr>
+          <w:ilvl w:val="0"/>
+          <w:numId w:val="37"/>
+        </w:numPr>
+      </w:pPr>
+      <w:r>
+        <w:t>Which products/categories combine low margin with high volume (cost/pricing risk) versus high margin with low volume?</w:t>
       </w:r>
     </w:p>
     <w:p>
@@ -291,7 +332,43 @@
         <w:pStyle w:val="BodyText"/>
       </w:pPr>
       <w:r>
-        <w:t xml:space="preserve">First, the data was loaded form PosgreSQL source – connection was established, and subsequently, the DM layer tables were imported into the report with their relationships. </w:t>
+        <w:t xml:space="preserve">The report addresses the previously identified data management problem (fragmented, hard-to-analyze transactional data across two source systems) by </w:t>
+      </w:r>
+      <w:r>
+        <w:t>enabling</w:t>
+      </w:r>
+      <w:r>
+        <w:t xml:space="preserve"> fast, accurate, and consistent self-service reporting.</w:t>
+      </w:r>
+    </w:p>
+    <w:p>
+      <w:pPr>
+        <w:pStyle w:val="Heading1"/>
+      </w:pPr>
+      <w:proofErr w:type="gramStart"/>
+      <w:r>
+        <w:lastRenderedPageBreak/>
+        <w:t>Report</w:t>
+      </w:r>
+      <w:proofErr w:type="gramEnd"/>
+      <w:r>
+        <w:t xml:space="preserve"> creation process</w:t>
+      </w:r>
+    </w:p>
+    <w:p>
+      <w:pPr>
+        <w:pStyle w:val="BodyText"/>
+      </w:pPr>
+      <w:r>
+        <w:t xml:space="preserve">First, the data was loaded form </w:t>
+      </w:r>
+      <w:proofErr w:type="spellStart"/>
+      <w:r>
+        <w:t>PosgreSQL</w:t>
+      </w:r>
+      <w:proofErr w:type="spellEnd"/>
+      <w:r>
+        <w:t xml:space="preserve"> source – connection was established, and subsequently, the DM layer tables were imported into the report with their relationships.</w:t>
       </w:r>
     </w:p>
     <w:p>
@@ -320,7 +397,7 @@
                     </pic:cNvPicPr>
                   </pic:nvPicPr>
                   <pic:blipFill>
-                    <a:blip r:embed="rId10">
+                    <a:blip r:embed="rId11">
                       <a:extLst>
                         <a:ext uri="{28A0092B-C50C-407E-A947-70E740481C1C}">
                           <a14:useLocalDpi xmlns:a14="http://schemas.microsoft.com/office/drawing/2010/main" val="0"/>
@@ -357,7 +434,15 @@
         <w:pStyle w:val="BodyText"/>
       </w:pPr>
       <w:r>
-        <w:t>Relationships were included in the data model – from foreign keys in BL_DM layer in data warehouse. All of them are considered active (one relationships per pair of tables), all of them are one to many (one key in dimension, many related records in fact table) and cross-filter direction set to single:</w:t>
+        <w:t xml:space="preserve">Relationships were included in the data model – from foreign keys in BL_DM layer in data warehouse. All of them are considered active (one relationships per pair of tables), all of them are one </w:t>
+      </w:r>
+      <w:proofErr w:type="gramStart"/>
+      <w:r>
+        <w:t>to</w:t>
+      </w:r>
+      <w:proofErr w:type="gramEnd"/>
+      <w:r>
+        <w:t xml:space="preserve"> many (one key in dimension, many related records in fact table) and cross-filter direction set to single:</w:t>
       </w:r>
     </w:p>
     <w:p>
@@ -387,7 +472,7 @@
                     </pic:cNvPicPr>
                   </pic:nvPicPr>
                   <pic:blipFill>
-                    <a:blip r:embed="rId11">
+                    <a:blip r:embed="rId12">
                       <a:extLst>
                         <a:ext uri="{28A0092B-C50C-407E-A947-70E740481C1C}">
                           <a14:useLocalDpi xmlns:a14="http://schemas.microsoft.com/office/drawing/2010/main" val="0"/>
@@ -424,7 +509,88 @@
         <w:pStyle w:val="BodyText"/>
       </w:pPr>
       <w:r>
-        <w:t>Then, the data was transformed. Firstly, the table bl_dm.dim_time_day was declared as a date table:</w:t>
+        <w:t xml:space="preserve">Then, the data was transformed. Firstly, the table </w:t>
+      </w:r>
+      <w:proofErr w:type="spellStart"/>
+      <w:r>
+        <w:t>bl_dm.dim_time_day</w:t>
+      </w:r>
+      <w:proofErr w:type="spellEnd"/>
+      <w:r>
+        <w:t xml:space="preserve"> was declared as a date table</w:t>
+      </w:r>
+      <w:r>
+        <w:t xml:space="preserve"> (</w:t>
+      </w:r>
+      <w:proofErr w:type="gramStart"/>
+      <w:r>
+        <w:t>in order to</w:t>
+      </w:r>
+      <w:proofErr w:type="gramEnd"/>
+      <w:r>
+        <w:t xml:space="preserve"> do that default row was filtered out due to gaps in dates)</w:t>
+      </w:r>
+      <w:r>
+        <w:t>:</w:t>
+      </w:r>
+    </w:p>
+    <w:p>
+      <w:pPr>
+        <w:pStyle w:val="BodyText"/>
+      </w:pPr>
+      <w:r>
+        <w:rPr>
+          <w:noProof/>
+        </w:rPr>
+        <w:lastRenderedPageBreak/>
+        <w:drawing>
+          <wp:inline distT="0" distB="0" distL="0" distR="0" wp14:anchorId="09B40931" wp14:editId="27EAF0D8">
+            <wp:extent cx="3543300" cy="4356100"/>
+            <wp:effectExtent l="0" t="0" r="0" b="6350"/>
+            <wp:docPr id="625429299" name="Picture 10"/>
+            <wp:cNvGraphicFramePr>
+              <a:graphicFrameLocks xmlns:a="http://schemas.openxmlformats.org/drawingml/2006/main" noChangeAspect="1"/>
+            </wp:cNvGraphicFramePr>
+            <a:graphic xmlns:a="http://schemas.openxmlformats.org/drawingml/2006/main">
+              <a:graphicData uri="http://schemas.openxmlformats.org/drawingml/2006/picture">
+                <pic:pic xmlns:pic="http://schemas.openxmlformats.org/drawingml/2006/picture">
+                  <pic:nvPicPr>
+                    <pic:cNvPr id="0" name="Picture 13"/>
+                    <pic:cNvPicPr>
+                      <a:picLocks noChangeAspect="1" noChangeArrowheads="1"/>
+                    </pic:cNvPicPr>
+                  </pic:nvPicPr>
+                  <pic:blipFill>
+                    <a:blip r:embed="rId13">
+                      <a:extLst>
+                        <a:ext uri="{28A0092B-C50C-407E-A947-70E740481C1C}">
+                          <a14:useLocalDpi xmlns:a14="http://schemas.microsoft.com/office/drawing/2010/main" val="0"/>
+                        </a:ext>
+                      </a:extLst>
+                    </a:blip>
+                    <a:srcRect/>
+                    <a:stretch>
+                      <a:fillRect/>
+                    </a:stretch>
+                  </pic:blipFill>
+                  <pic:spPr bwMode="auto">
+                    <a:xfrm>
+                      <a:off x="0" y="0"/>
+                      <a:ext cx="3543300" cy="4356100"/>
+                    </a:xfrm>
+                    <a:prstGeom prst="rect">
+                      <a:avLst/>
+                    </a:prstGeom>
+                    <a:noFill/>
+                    <a:ln>
+                      <a:noFill/>
+                    </a:ln>
+                  </pic:spPr>
+                </pic:pic>
+              </a:graphicData>
+            </a:graphic>
+          </wp:inline>
+        </w:drawing>
       </w:r>
     </w:p>
     <w:p>
@@ -461,7 +627,7 @@
                     </pic:cNvPicPr>
                   </pic:nvPicPr>
                   <pic:blipFill>
-                    <a:blip r:embed="rId12">
+                    <a:blip r:embed="rId14">
                       <a:extLst>
                         <a:ext uri="{28A0092B-C50C-407E-A947-70E740481C1C}">
                           <a14:useLocalDpi xmlns:a14="http://schemas.microsoft.com/office/drawing/2010/main" val="0"/>
@@ -501,7 +667,6 @@
         <w:rPr>
           <w:noProof/>
         </w:rPr>
-        <w:lastRenderedPageBreak/>
         <w:drawing>
           <wp:inline distT="0" distB="0" distL="0" distR="0" wp14:anchorId="39B11D9C" wp14:editId="56928E4D">
             <wp:extent cx="5238750" cy="1447800"/>
@@ -520,7 +685,7 @@
                     </pic:cNvPicPr>
                   </pic:nvPicPr>
                   <pic:blipFill>
-                    <a:blip r:embed="rId13">
+                    <a:blip r:embed="rId15">
                       <a:extLst>
                         <a:ext uri="{28A0092B-C50C-407E-A947-70E740481C1C}">
                           <a14:useLocalDpi xmlns:a14="http://schemas.microsoft.com/office/drawing/2010/main" val="0"/>
@@ -568,6 +733,7 @@
         <w:rPr>
           <w:noProof/>
         </w:rPr>
+        <w:lastRenderedPageBreak/>
         <w:drawing>
           <wp:inline distT="0" distB="0" distL="0" distR="0" wp14:anchorId="6D63AA92" wp14:editId="781285EE">
             <wp:extent cx="5219700" cy="1784350"/>
@@ -586,7 +752,7 @@
                     </pic:cNvPicPr>
                   </pic:nvPicPr>
                   <pic:blipFill>
-                    <a:blip r:embed="rId14">
+                    <a:blip r:embed="rId16">
                       <a:extLst>
                         <a:ext uri="{28A0092B-C50C-407E-A947-70E740481C1C}">
                           <a14:useLocalDpi xmlns:a14="http://schemas.microsoft.com/office/drawing/2010/main" val="0"/>
@@ -620,6 +786,781 @@
     </w:p>
     <w:p>
       <w:pPr>
+        <w:pStyle w:val="BodyText"/>
+      </w:pPr>
+      <w:r>
+        <w:t xml:space="preserve">Other initial data transformations included </w:t>
+      </w:r>
+      <w:proofErr w:type="spellStart"/>
+      <w:r>
+        <w:t>f.e</w:t>
+      </w:r>
+      <w:proofErr w:type="spellEnd"/>
+      <w:r>
+        <w:t>. getting the full address into one additional column for map visuals and renaming columns used in figures.</w:t>
+      </w:r>
+    </w:p>
+    <w:p>
+      <w:pPr>
+        <w:pStyle w:val="BodyText"/>
+      </w:pPr>
+      <w:r>
+        <w:t xml:space="preserve">Then, </w:t>
+      </w:r>
+      <w:proofErr w:type="gramStart"/>
+      <w:r>
+        <w:t>the table</w:t>
+      </w:r>
+      <w:proofErr w:type="gramEnd"/>
+      <w:r>
+        <w:t xml:space="preserve"> Measures was created, and it was set to store measures for statistical analysis</w:t>
+      </w:r>
+      <w:r>
+        <w:t xml:space="preserve"> and other columns that were needed for aesthetic purposes</w:t>
+      </w:r>
+      <w:r>
+        <w:t xml:space="preserve"> (such as conditional titles and rankings)</w:t>
+      </w:r>
+      <w:r>
+        <w:t>:</w:t>
+      </w:r>
+    </w:p>
+    <w:p>
+      <w:pPr>
+        <w:pStyle w:val="BodyText"/>
+      </w:pPr>
+      <w:r>
+        <w:rPr>
+          <w:noProof/>
+        </w:rPr>
+        <w:drawing>
+          <wp:inline distT="0" distB="0" distL="0" distR="0" wp14:anchorId="6E8E2E72" wp14:editId="4838A870">
+            <wp:extent cx="2012950" cy="2914650"/>
+            <wp:effectExtent l="0" t="0" r="6350" b="0"/>
+            <wp:docPr id="269561311" name="Picture 15"/>
+            <wp:cNvGraphicFramePr>
+              <a:graphicFrameLocks xmlns:a="http://schemas.openxmlformats.org/drawingml/2006/main" noChangeAspect="1"/>
+            </wp:cNvGraphicFramePr>
+            <a:graphic xmlns:a="http://schemas.openxmlformats.org/drawingml/2006/main">
+              <a:graphicData uri="http://schemas.openxmlformats.org/drawingml/2006/picture">
+                <pic:pic xmlns:pic="http://schemas.openxmlformats.org/drawingml/2006/picture">
+                  <pic:nvPicPr>
+                    <pic:cNvPr id="0" name="Picture 23"/>
+                    <pic:cNvPicPr>
+                      <a:picLocks noChangeAspect="1" noChangeArrowheads="1"/>
+                    </pic:cNvPicPr>
+                  </pic:nvPicPr>
+                  <pic:blipFill>
+                    <a:blip r:embed="rId17">
+                      <a:extLst>
+                        <a:ext uri="{28A0092B-C50C-407E-A947-70E740481C1C}">
+                          <a14:useLocalDpi xmlns:a14="http://schemas.microsoft.com/office/drawing/2010/main" val="0"/>
+                        </a:ext>
+                      </a:extLst>
+                    </a:blip>
+                    <a:srcRect/>
+                    <a:stretch>
+                      <a:fillRect/>
+                    </a:stretch>
+                  </pic:blipFill>
+                  <pic:spPr bwMode="auto">
+                    <a:xfrm>
+                      <a:off x="0" y="0"/>
+                      <a:ext cx="2012950" cy="2914650"/>
+                    </a:xfrm>
+                    <a:prstGeom prst="rect">
+                      <a:avLst/>
+                    </a:prstGeom>
+                    <a:noFill/>
+                    <a:ln>
+                      <a:noFill/>
+                    </a:ln>
+                  </pic:spPr>
+                </pic:pic>
+              </a:graphicData>
+            </a:graphic>
+          </wp:inline>
+        </w:drawing>
+      </w:r>
+      <w:r>
+        <w:br w:type="textWrapping" w:clear="all"/>
+      </w:r>
+    </w:p>
+    <w:p>
+      <w:pPr>
+        <w:pStyle w:val="BodyText"/>
+      </w:pPr>
+      <w:r>
+        <w:t>Report structure</w:t>
+      </w:r>
+      <w:r>
+        <w:t>:</w:t>
+      </w:r>
+    </w:p>
+    <w:p>
+      <w:pPr>
+        <w:pStyle w:val="BodyText"/>
+      </w:pPr>
+      <w:r>
+        <w:t>3 visible pages</w:t>
+      </w:r>
+      <w:r>
+        <w:t xml:space="preserve"> were created</w:t>
+      </w:r>
+      <w:r>
+        <w:t>:</w:t>
+      </w:r>
+    </w:p>
+    <w:p>
+      <w:pPr>
+        <w:pStyle w:val="BodyText"/>
+        <w:numPr>
+          <w:ilvl w:val="0"/>
+          <w:numId w:val="38"/>
+        </w:numPr>
+      </w:pPr>
+      <w:r>
+        <w:t>Sales</w:t>
+      </w:r>
+      <w:r>
+        <w:t xml:space="preserve"> Overview </w:t>
+      </w:r>
+      <w:r>
+        <w:t>-</w:t>
+      </w:r>
+      <w:r>
+        <w:t xml:space="preserve"> KPI cards with trend indicators, net sales trend vs. prior year, Retail vs. E-commerce channel split, s</w:t>
+      </w:r>
+      <w:r>
+        <w:t>ales</w:t>
+      </w:r>
+      <w:r>
+        <w:t xml:space="preserve"> location map, top 5 </w:t>
+      </w:r>
+      <w:r>
+        <w:t xml:space="preserve">product </w:t>
+      </w:r>
+      <w:r>
+        <w:t>categories</w:t>
+      </w:r>
+      <w:r>
+        <w:t>.</w:t>
+      </w:r>
+    </w:p>
+    <w:p>
+      <w:pPr>
+        <w:pStyle w:val="BodyText"/>
+        <w:numPr>
+          <w:ilvl w:val="0"/>
+          <w:numId w:val="38"/>
+        </w:numPr>
+      </w:pPr>
+      <w:r>
+        <w:t xml:space="preserve">Product &amp; Category Analysis </w:t>
+      </w:r>
+      <w:r>
+        <w:t>-</w:t>
+      </w:r>
+      <w:r>
+        <w:t xml:space="preserve"> category hierarchy matrix with conditional-formatted margin, </w:t>
+      </w:r>
+      <w:proofErr w:type="spellStart"/>
+      <w:r>
+        <w:t>treemap</w:t>
+      </w:r>
+      <w:proofErr w:type="spellEnd"/>
+      <w:r>
+        <w:t>, seasonality column chart, quantity-vs-margin scatter plot.</w:t>
+      </w:r>
+    </w:p>
+    <w:p>
+      <w:pPr>
+        <w:pStyle w:val="BodyText"/>
+        <w:numPr>
+          <w:ilvl w:val="0"/>
+          <w:numId w:val="38"/>
+        </w:numPr>
+      </w:pPr>
+      <w:r>
+        <w:t xml:space="preserve">Channel, </w:t>
+      </w:r>
+      <w:r>
+        <w:t>Employee</w:t>
+      </w:r>
+      <w:r>
+        <w:t xml:space="preserve"> &amp; Customer Insights </w:t>
+      </w:r>
+      <w:r>
+        <w:t>-</w:t>
+      </w:r>
+      <w:r>
+        <w:t xml:space="preserve"> sales by store zone, employee ranking</w:t>
+      </w:r>
+      <w:r>
+        <w:t xml:space="preserve">, </w:t>
+      </w:r>
+      <w:r>
+        <w:t>payment method donut, gender distribution, Average Order Value and unique customer KPIs.</w:t>
+      </w:r>
+    </w:p>
+    <w:p>
+      <w:pPr>
+        <w:pStyle w:val="BodyText"/>
+      </w:pPr>
+      <w:r>
+        <w:rPr>
+          <w:noProof/>
+        </w:rPr>
+        <w:lastRenderedPageBreak/>
+        <w:drawing>
+          <wp:inline distT="0" distB="0" distL="0" distR="0" wp14:anchorId="67BE9463" wp14:editId="1B43E4B8">
+            <wp:extent cx="5941695" cy="3435985"/>
+            <wp:effectExtent l="0" t="0" r="1905" b="0"/>
+            <wp:docPr id="220074373" name="Picture 20"/>
+            <wp:cNvGraphicFramePr>
+              <a:graphicFrameLocks xmlns:a="http://schemas.openxmlformats.org/drawingml/2006/main" noChangeAspect="1"/>
+            </wp:cNvGraphicFramePr>
+            <a:graphic xmlns:a="http://schemas.openxmlformats.org/drawingml/2006/main">
+              <a:graphicData uri="http://schemas.openxmlformats.org/drawingml/2006/picture">
+                <pic:pic xmlns:pic="http://schemas.openxmlformats.org/drawingml/2006/picture">
+                  <pic:nvPicPr>
+                    <pic:cNvPr id="0" name="Picture 36"/>
+                    <pic:cNvPicPr>
+                      <a:picLocks noChangeAspect="1" noChangeArrowheads="1"/>
+                    </pic:cNvPicPr>
+                  </pic:nvPicPr>
+                  <pic:blipFill>
+                    <a:blip r:embed="rId18">
+                      <a:extLst>
+                        <a:ext uri="{28A0092B-C50C-407E-A947-70E740481C1C}">
+                          <a14:useLocalDpi xmlns:a14="http://schemas.microsoft.com/office/drawing/2010/main" val="0"/>
+                        </a:ext>
+                      </a:extLst>
+                    </a:blip>
+                    <a:srcRect/>
+                    <a:stretch>
+                      <a:fillRect/>
+                    </a:stretch>
+                  </pic:blipFill>
+                  <pic:spPr bwMode="auto">
+                    <a:xfrm>
+                      <a:off x="0" y="0"/>
+                      <a:ext cx="5941695" cy="3435985"/>
+                    </a:xfrm>
+                    <a:prstGeom prst="rect">
+                      <a:avLst/>
+                    </a:prstGeom>
+                    <a:noFill/>
+                    <a:ln>
+                      <a:noFill/>
+                    </a:ln>
+                  </pic:spPr>
+                </pic:pic>
+              </a:graphicData>
+            </a:graphic>
+          </wp:inline>
+        </w:drawing>
+      </w:r>
+    </w:p>
+    <w:p>
+      <w:pPr>
+        <w:pStyle w:val="BodyText"/>
+      </w:pPr>
+      <w:r>
+        <w:rPr>
+          <w:noProof/>
+        </w:rPr>
+        <w:drawing>
+          <wp:inline distT="0" distB="0" distL="0" distR="0" wp14:anchorId="62FD98ED" wp14:editId="6B8E43A4">
+            <wp:extent cx="5941695" cy="3371215"/>
+            <wp:effectExtent l="0" t="0" r="1905" b="635"/>
+            <wp:docPr id="180825883" name="Picture 21"/>
+            <wp:cNvGraphicFramePr>
+              <a:graphicFrameLocks xmlns:a="http://schemas.openxmlformats.org/drawingml/2006/main" noChangeAspect="1"/>
+            </wp:cNvGraphicFramePr>
+            <a:graphic xmlns:a="http://schemas.openxmlformats.org/drawingml/2006/main">
+              <a:graphicData uri="http://schemas.openxmlformats.org/drawingml/2006/picture">
+                <pic:pic xmlns:pic="http://schemas.openxmlformats.org/drawingml/2006/picture">
+                  <pic:nvPicPr>
+                    <pic:cNvPr id="0" name="Picture 38"/>
+                    <pic:cNvPicPr>
+                      <a:picLocks noChangeAspect="1" noChangeArrowheads="1"/>
+                    </pic:cNvPicPr>
+                  </pic:nvPicPr>
+                  <pic:blipFill>
+                    <a:blip r:embed="rId19">
+                      <a:extLst>
+                        <a:ext uri="{28A0092B-C50C-407E-A947-70E740481C1C}">
+                          <a14:useLocalDpi xmlns:a14="http://schemas.microsoft.com/office/drawing/2010/main" val="0"/>
+                        </a:ext>
+                      </a:extLst>
+                    </a:blip>
+                    <a:srcRect/>
+                    <a:stretch>
+                      <a:fillRect/>
+                    </a:stretch>
+                  </pic:blipFill>
+                  <pic:spPr bwMode="auto">
+                    <a:xfrm>
+                      <a:off x="0" y="0"/>
+                      <a:ext cx="5941695" cy="3371215"/>
+                    </a:xfrm>
+                    <a:prstGeom prst="rect">
+                      <a:avLst/>
+                    </a:prstGeom>
+                    <a:noFill/>
+                    <a:ln>
+                      <a:noFill/>
+                    </a:ln>
+                  </pic:spPr>
+                </pic:pic>
+              </a:graphicData>
+            </a:graphic>
+          </wp:inline>
+        </w:drawing>
+      </w:r>
+    </w:p>
+    <w:p>
+      <w:pPr>
+        <w:pStyle w:val="BodyText"/>
+      </w:pPr>
+      <w:r>
+        <w:rPr>
+          <w:noProof/>
+        </w:rPr>
+        <w:lastRenderedPageBreak/>
+        <w:drawing>
+          <wp:inline distT="0" distB="0" distL="0" distR="0" wp14:anchorId="5010D062" wp14:editId="62B72D1A">
+            <wp:extent cx="5941695" cy="3378200"/>
+            <wp:effectExtent l="0" t="0" r="1905" b="0"/>
+            <wp:docPr id="42602525" name="Picture 22"/>
+            <wp:cNvGraphicFramePr>
+              <a:graphicFrameLocks xmlns:a="http://schemas.openxmlformats.org/drawingml/2006/main" noChangeAspect="1"/>
+            </wp:cNvGraphicFramePr>
+            <a:graphic xmlns:a="http://schemas.openxmlformats.org/drawingml/2006/main">
+              <a:graphicData uri="http://schemas.openxmlformats.org/drawingml/2006/picture">
+                <pic:pic xmlns:pic="http://schemas.openxmlformats.org/drawingml/2006/picture">
+                  <pic:nvPicPr>
+                    <pic:cNvPr id="0" name="Picture 40"/>
+                    <pic:cNvPicPr>
+                      <a:picLocks noChangeAspect="1" noChangeArrowheads="1"/>
+                    </pic:cNvPicPr>
+                  </pic:nvPicPr>
+                  <pic:blipFill>
+                    <a:blip r:embed="rId20">
+                      <a:extLst>
+                        <a:ext uri="{28A0092B-C50C-407E-A947-70E740481C1C}">
+                          <a14:useLocalDpi xmlns:a14="http://schemas.microsoft.com/office/drawing/2010/main" val="0"/>
+                        </a:ext>
+                      </a:extLst>
+                    </a:blip>
+                    <a:srcRect/>
+                    <a:stretch>
+                      <a:fillRect/>
+                    </a:stretch>
+                  </pic:blipFill>
+                  <pic:spPr bwMode="auto">
+                    <a:xfrm>
+                      <a:off x="0" y="0"/>
+                      <a:ext cx="5941695" cy="3378200"/>
+                    </a:xfrm>
+                    <a:prstGeom prst="rect">
+                      <a:avLst/>
+                    </a:prstGeom>
+                    <a:noFill/>
+                    <a:ln>
+                      <a:noFill/>
+                    </a:ln>
+                  </pic:spPr>
+                </pic:pic>
+              </a:graphicData>
+            </a:graphic>
+          </wp:inline>
+        </w:drawing>
+      </w:r>
+    </w:p>
+    <w:p>
+      <w:pPr>
+        <w:pStyle w:val="BodyText"/>
+      </w:pPr>
+      <w:r>
+        <w:t>Furthermore, 3 h</w:t>
+      </w:r>
+      <w:r>
+        <w:t>idden pages</w:t>
+      </w:r>
+      <w:r>
+        <w:t xml:space="preserve"> were created</w:t>
+      </w:r>
+      <w:r>
+        <w:t xml:space="preserve">: </w:t>
+      </w:r>
+      <w:proofErr w:type="spellStart"/>
+      <w:r>
+        <w:t>Drillthrough</w:t>
+      </w:r>
+      <w:proofErr w:type="spellEnd"/>
+      <w:r>
+        <w:t xml:space="preserve"> targets (Product Detail, Store/Employee Detail)</w:t>
+      </w:r>
+      <w:r>
+        <w:t xml:space="preserve"> and a</w:t>
+      </w:r>
+      <w:r>
+        <w:t xml:space="preserve"> custom tooltip page (Store mini-KPI tooltip</w:t>
+      </w:r>
+      <w:r>
+        <w:t xml:space="preserve"> – used in maps where stores are displayed).</w:t>
+      </w:r>
+    </w:p>
+    <w:p>
+      <w:pPr>
+        <w:pStyle w:val="BodyText"/>
+      </w:pPr>
+      <w:r>
+        <w:rPr>
+          <w:noProof/>
+        </w:rPr>
+        <w:drawing>
+          <wp:inline distT="0" distB="0" distL="0" distR="0" wp14:anchorId="1454F27D" wp14:editId="4C5BFA1F">
+            <wp:extent cx="3251200" cy="2432050"/>
+            <wp:effectExtent l="0" t="0" r="6350" b="6350"/>
+            <wp:docPr id="803942554" name="Picture 16"/>
+            <wp:cNvGraphicFramePr>
+              <a:graphicFrameLocks xmlns:a="http://schemas.openxmlformats.org/drawingml/2006/main" noChangeAspect="1"/>
+            </wp:cNvGraphicFramePr>
+            <a:graphic xmlns:a="http://schemas.openxmlformats.org/drawingml/2006/main">
+              <a:graphicData uri="http://schemas.openxmlformats.org/drawingml/2006/picture">
+                <pic:pic xmlns:pic="http://schemas.openxmlformats.org/drawingml/2006/picture">
+                  <pic:nvPicPr>
+                    <pic:cNvPr id="0" name="Picture 25"/>
+                    <pic:cNvPicPr>
+                      <a:picLocks noChangeAspect="1" noChangeArrowheads="1"/>
+                    </pic:cNvPicPr>
+                  </pic:nvPicPr>
+                  <pic:blipFill>
+                    <a:blip r:embed="rId21">
+                      <a:extLst>
+                        <a:ext uri="{28A0092B-C50C-407E-A947-70E740481C1C}">
+                          <a14:useLocalDpi xmlns:a14="http://schemas.microsoft.com/office/drawing/2010/main" val="0"/>
+                        </a:ext>
+                      </a:extLst>
+                    </a:blip>
+                    <a:srcRect/>
+                    <a:stretch>
+                      <a:fillRect/>
+                    </a:stretch>
+                  </pic:blipFill>
+                  <pic:spPr bwMode="auto">
+                    <a:xfrm>
+                      <a:off x="0" y="0"/>
+                      <a:ext cx="3251200" cy="2432050"/>
+                    </a:xfrm>
+                    <a:prstGeom prst="rect">
+                      <a:avLst/>
+                    </a:prstGeom>
+                    <a:noFill/>
+                    <a:ln>
+                      <a:noFill/>
+                    </a:ln>
+                  </pic:spPr>
+                </pic:pic>
+              </a:graphicData>
+            </a:graphic>
+          </wp:inline>
+        </w:drawing>
+      </w:r>
+    </w:p>
+    <w:p>
+      <w:pPr>
+        <w:pStyle w:val="BodyText"/>
+      </w:pPr>
+      <w:r>
+        <w:rPr>
+          <w:noProof/>
+        </w:rPr>
+        <w:lastRenderedPageBreak/>
+        <w:drawing>
+          <wp:inline distT="0" distB="0" distL="0" distR="0" wp14:anchorId="223FD775" wp14:editId="0F0C51AF">
+            <wp:extent cx="5941695" cy="3368040"/>
+            <wp:effectExtent l="0" t="0" r="1905" b="3810"/>
+            <wp:docPr id="520436750" name="Picture 23"/>
+            <wp:cNvGraphicFramePr>
+              <a:graphicFrameLocks xmlns:a="http://schemas.openxmlformats.org/drawingml/2006/main" noChangeAspect="1"/>
+            </wp:cNvGraphicFramePr>
+            <a:graphic xmlns:a="http://schemas.openxmlformats.org/drawingml/2006/main">
+              <a:graphicData uri="http://schemas.openxmlformats.org/drawingml/2006/picture">
+                <pic:pic xmlns:pic="http://schemas.openxmlformats.org/drawingml/2006/picture">
+                  <pic:nvPicPr>
+                    <pic:cNvPr id="0" name="Picture 42"/>
+                    <pic:cNvPicPr>
+                      <a:picLocks noChangeAspect="1" noChangeArrowheads="1"/>
+                    </pic:cNvPicPr>
+                  </pic:nvPicPr>
+                  <pic:blipFill>
+                    <a:blip r:embed="rId22">
+                      <a:extLst>
+                        <a:ext uri="{28A0092B-C50C-407E-A947-70E740481C1C}">
+                          <a14:useLocalDpi xmlns:a14="http://schemas.microsoft.com/office/drawing/2010/main" val="0"/>
+                        </a:ext>
+                      </a:extLst>
+                    </a:blip>
+                    <a:srcRect/>
+                    <a:stretch>
+                      <a:fillRect/>
+                    </a:stretch>
+                  </pic:blipFill>
+                  <pic:spPr bwMode="auto">
+                    <a:xfrm>
+                      <a:off x="0" y="0"/>
+                      <a:ext cx="5941695" cy="3368040"/>
+                    </a:xfrm>
+                    <a:prstGeom prst="rect">
+                      <a:avLst/>
+                    </a:prstGeom>
+                    <a:noFill/>
+                    <a:ln>
+                      <a:noFill/>
+                    </a:ln>
+                  </pic:spPr>
+                </pic:pic>
+              </a:graphicData>
+            </a:graphic>
+          </wp:inline>
+        </w:drawing>
+      </w:r>
+    </w:p>
+    <w:p>
+      <w:pPr>
+        <w:pStyle w:val="BodyText"/>
+      </w:pPr>
+      <w:r>
+        <w:rPr>
+          <w:noProof/>
+        </w:rPr>
+        <w:drawing>
+          <wp:inline distT="0" distB="0" distL="0" distR="0" wp14:anchorId="47923B6C" wp14:editId="3CE5F136">
+            <wp:extent cx="5941695" cy="3431540"/>
+            <wp:effectExtent l="0" t="0" r="1905" b="0"/>
+            <wp:docPr id="1480546728" name="Picture 24"/>
+            <wp:cNvGraphicFramePr>
+              <a:graphicFrameLocks xmlns:a="http://schemas.openxmlformats.org/drawingml/2006/main" noChangeAspect="1"/>
+            </wp:cNvGraphicFramePr>
+            <a:graphic xmlns:a="http://schemas.openxmlformats.org/drawingml/2006/main">
+              <a:graphicData uri="http://schemas.openxmlformats.org/drawingml/2006/picture">
+                <pic:pic xmlns:pic="http://schemas.openxmlformats.org/drawingml/2006/picture">
+                  <pic:nvPicPr>
+                    <pic:cNvPr id="0" name="Picture 44"/>
+                    <pic:cNvPicPr>
+                      <a:picLocks noChangeAspect="1" noChangeArrowheads="1"/>
+                    </pic:cNvPicPr>
+                  </pic:nvPicPr>
+                  <pic:blipFill>
+                    <a:blip r:embed="rId23">
+                      <a:extLst>
+                        <a:ext uri="{28A0092B-C50C-407E-A947-70E740481C1C}">
+                          <a14:useLocalDpi xmlns:a14="http://schemas.microsoft.com/office/drawing/2010/main" val="0"/>
+                        </a:ext>
+                      </a:extLst>
+                    </a:blip>
+                    <a:srcRect/>
+                    <a:stretch>
+                      <a:fillRect/>
+                    </a:stretch>
+                  </pic:blipFill>
+                  <pic:spPr bwMode="auto">
+                    <a:xfrm>
+                      <a:off x="0" y="0"/>
+                      <a:ext cx="5941695" cy="3431540"/>
+                    </a:xfrm>
+                    <a:prstGeom prst="rect">
+                      <a:avLst/>
+                    </a:prstGeom>
+                    <a:noFill/>
+                    <a:ln>
+                      <a:noFill/>
+                    </a:ln>
+                  </pic:spPr>
+                </pic:pic>
+              </a:graphicData>
+            </a:graphic>
+          </wp:inline>
+        </w:drawing>
+      </w:r>
+    </w:p>
+    <w:p>
+      <w:pPr>
+        <w:pStyle w:val="BodyText"/>
+      </w:pPr>
+    </w:p>
+    <w:p>
+      <w:pPr>
+        <w:pStyle w:val="BodyText"/>
+      </w:pPr>
+      <w:r>
+        <w:t>Moreover, two buttons are displayed on every page – those are in control of bookmarks which change visuals between different KPIs – Net Sales and Gross Profit – they only work on visuals containing those metrics:</w:t>
+      </w:r>
+    </w:p>
+    <w:p>
+      <w:pPr>
+        <w:pStyle w:val="BodyText"/>
+      </w:pPr>
+      <w:r>
+        <w:rPr>
+          <w:noProof/>
+        </w:rPr>
+        <w:lastRenderedPageBreak/>
+        <w:drawing>
+          <wp:inline distT="0" distB="0" distL="0" distR="0" wp14:anchorId="403A8EE9" wp14:editId="3638887D">
+            <wp:extent cx="2260600" cy="1308100"/>
+            <wp:effectExtent l="0" t="0" r="6350" b="6350"/>
+            <wp:docPr id="122134475" name="Picture 17"/>
+            <wp:cNvGraphicFramePr>
+              <a:graphicFrameLocks xmlns:a="http://schemas.openxmlformats.org/drawingml/2006/main" noChangeAspect="1"/>
+            </wp:cNvGraphicFramePr>
+            <a:graphic xmlns:a="http://schemas.openxmlformats.org/drawingml/2006/main">
+              <a:graphicData uri="http://schemas.openxmlformats.org/drawingml/2006/picture">
+                <pic:pic xmlns:pic="http://schemas.openxmlformats.org/drawingml/2006/picture">
+                  <pic:nvPicPr>
+                    <pic:cNvPr id="0" name="Picture 27"/>
+                    <pic:cNvPicPr>
+                      <a:picLocks noChangeAspect="1" noChangeArrowheads="1"/>
+                    </pic:cNvPicPr>
+                  </pic:nvPicPr>
+                  <pic:blipFill>
+                    <a:blip r:embed="rId24">
+                      <a:extLst>
+                        <a:ext uri="{28A0092B-C50C-407E-A947-70E740481C1C}">
+                          <a14:useLocalDpi xmlns:a14="http://schemas.microsoft.com/office/drawing/2010/main" val="0"/>
+                        </a:ext>
+                      </a:extLst>
+                    </a:blip>
+                    <a:srcRect/>
+                    <a:stretch>
+                      <a:fillRect/>
+                    </a:stretch>
+                  </pic:blipFill>
+                  <pic:spPr bwMode="auto">
+                    <a:xfrm>
+                      <a:off x="0" y="0"/>
+                      <a:ext cx="2260600" cy="1308100"/>
+                    </a:xfrm>
+                    <a:prstGeom prst="rect">
+                      <a:avLst/>
+                    </a:prstGeom>
+                    <a:noFill/>
+                    <a:ln>
+                      <a:noFill/>
+                    </a:ln>
+                  </pic:spPr>
+                </pic:pic>
+              </a:graphicData>
+            </a:graphic>
+          </wp:inline>
+        </w:drawing>
+      </w:r>
+    </w:p>
+    <w:p>
+      <w:pPr>
+        <w:pStyle w:val="BodyText"/>
+      </w:pPr>
+      <w:r>
+        <w:t>On every page 3 slicers are also available – they enable filtering the data for various end user needs. They are kept whilst switching pages:</w:t>
+      </w:r>
+    </w:p>
+    <w:p>
+      <w:pPr>
+        <w:pStyle w:val="BodyText"/>
+      </w:pPr>
+      <w:r>
+        <w:rPr>
+          <w:noProof/>
+        </w:rPr>
+        <w:drawing>
+          <wp:anchor distT="0" distB="0" distL="114300" distR="114300" simplePos="0" relativeHeight="251658240" behindDoc="0" locked="0" layoutInCell="1" allowOverlap="1" wp14:anchorId="28D1D368" wp14:editId="744EDB2B">
+            <wp:simplePos x="1079500" y="2686050"/>
+            <wp:positionH relativeFrom="column">
+              <wp:align>left</wp:align>
+            </wp:positionH>
+            <wp:positionV relativeFrom="paragraph">
+              <wp:align>top</wp:align>
+            </wp:positionV>
+            <wp:extent cx="2355850" cy="4819650"/>
+            <wp:effectExtent l="0" t="0" r="6350" b="0"/>
+            <wp:wrapSquare wrapText="bothSides"/>
+            <wp:docPr id="370775518" name="Picture 18"/>
+            <wp:cNvGraphicFramePr>
+              <a:graphicFrameLocks xmlns:a="http://schemas.openxmlformats.org/drawingml/2006/main" noChangeAspect="1"/>
+            </wp:cNvGraphicFramePr>
+            <a:graphic xmlns:a="http://schemas.openxmlformats.org/drawingml/2006/main">
+              <a:graphicData uri="http://schemas.openxmlformats.org/drawingml/2006/picture">
+                <pic:pic xmlns:pic="http://schemas.openxmlformats.org/drawingml/2006/picture">
+                  <pic:nvPicPr>
+                    <pic:cNvPr id="0" name="Picture 29"/>
+                    <pic:cNvPicPr>
+                      <a:picLocks noChangeAspect="1" noChangeArrowheads="1"/>
+                    </pic:cNvPicPr>
+                  </pic:nvPicPr>
+                  <pic:blipFill>
+                    <a:blip r:embed="rId25">
+                      <a:extLst>
+                        <a:ext uri="{28A0092B-C50C-407E-A947-70E740481C1C}">
+                          <a14:useLocalDpi xmlns:a14="http://schemas.microsoft.com/office/drawing/2010/main" val="0"/>
+                        </a:ext>
+                      </a:extLst>
+                    </a:blip>
+                    <a:srcRect/>
+                    <a:stretch>
+                      <a:fillRect/>
+                    </a:stretch>
+                  </pic:blipFill>
+                  <pic:spPr bwMode="auto">
+                    <a:xfrm>
+                      <a:off x="0" y="0"/>
+                      <a:ext cx="2355850" cy="4819650"/>
+                    </a:xfrm>
+                    <a:prstGeom prst="rect">
+                      <a:avLst/>
+                    </a:prstGeom>
+                    <a:noFill/>
+                    <a:ln>
+                      <a:noFill/>
+                    </a:ln>
+                  </pic:spPr>
+                </pic:pic>
+              </a:graphicData>
+            </a:graphic>
+          </wp:anchor>
+        </w:drawing>
+      </w:r>
+      <w:r>
+        <w:br w:type="textWrapping" w:clear="all"/>
+      </w:r>
+    </w:p>
+    <w:p>
+      <w:pPr>
+        <w:pStyle w:val="BodyText"/>
+      </w:pPr>
+      <w:r>
+        <w:t>The entirety of the report uses common color theme and heading. In a few field conditional coloring and titling in used. Drill</w:t>
+      </w:r>
+      <w:r>
+        <w:t>-</w:t>
+      </w:r>
+      <w:r>
+        <w:t xml:space="preserve">throughs including product detail or Store &amp; Employee Detail are available in </w:t>
+      </w:r>
+      <w:proofErr w:type="gramStart"/>
+      <w:r>
+        <w:t>all of</w:t>
+      </w:r>
+      <w:proofErr w:type="gramEnd"/>
+      <w:r>
+        <w:t xml:space="preserve"> the figures containing such information, on the details page there is a “go back” button available. While hovering over store bubble on maps containing store sales data a tooltip with corresponding KPIs appears.</w:t>
+      </w:r>
+    </w:p>
+    <w:p>
+      <w:pPr>
         <w:pStyle w:val="ListParagraph"/>
         <w:keepNext/>
         <w:widowControl/>
@@ -650,34 +1591,141 @@
     </w:p>
     <w:p>
       <w:pPr>
-        <w:widowControl/>
-        <w:spacing w:after="160" w:line="256" w:lineRule="auto"/>
-        <w:rPr>
-          <w:rFonts w:ascii="Arial" w:hAnsi="Arial" w:cs="Arial"/>
-          <w:color w:val="FF0000"/>
-        </w:rPr>
-      </w:pPr>
-      <w:r>
-        <w:rPr>
-          <w:rFonts w:ascii="Arial" w:hAnsi="Arial" w:cs="Arial"/>
-          <w:color w:val="FF0000"/>
-        </w:rPr>
-        <w:t>Publish the report to Power BI Service Portal and include the screenshot of published report into Word document.</w:t>
+        <w:pStyle w:val="BodyText"/>
+      </w:pPr>
+      <w:r>
+        <w:t xml:space="preserve">Lastly, the report was published in </w:t>
+      </w:r>
+      <w:proofErr w:type="spellStart"/>
+      <w:r>
+        <w:t>PowerBI</w:t>
+      </w:r>
+      <w:proofErr w:type="spellEnd"/>
+      <w:r>
+        <w:t xml:space="preserve"> Service:</w:t>
       </w:r>
     </w:p>
     <w:p>
       <w:pPr>
-        <w:widowControl/>
-        <w:spacing w:after="160" w:line="256" w:lineRule="auto"/>
+        <w:pStyle w:val="BodyText"/>
+      </w:pPr>
+      <w:r>
         <w:rPr>
-          <w:rFonts w:ascii="Arial" w:hAnsi="Arial" w:cs="Arial"/>
+          <w:noProof/>
         </w:rPr>
-      </w:pPr>
+        <w:lastRenderedPageBreak/>
+        <w:drawing>
+          <wp:inline distT="0" distB="0" distL="0" distR="0" wp14:anchorId="12E1650C" wp14:editId="53EDBD4F">
+            <wp:extent cx="5137150" cy="3105150"/>
+            <wp:effectExtent l="0" t="0" r="6350" b="0"/>
+            <wp:docPr id="1246314829" name="Picture 14"/>
+            <wp:cNvGraphicFramePr>
+              <a:graphicFrameLocks xmlns:a="http://schemas.openxmlformats.org/drawingml/2006/main" noChangeAspect="1"/>
+            </wp:cNvGraphicFramePr>
+            <a:graphic xmlns:a="http://schemas.openxmlformats.org/drawingml/2006/main">
+              <a:graphicData uri="http://schemas.openxmlformats.org/drawingml/2006/picture">
+                <pic:pic xmlns:pic="http://schemas.openxmlformats.org/drawingml/2006/picture">
+                  <pic:nvPicPr>
+                    <pic:cNvPr id="0" name="Picture 21"/>
+                    <pic:cNvPicPr>
+                      <a:picLocks noChangeAspect="1" noChangeArrowheads="1"/>
+                    </pic:cNvPicPr>
+                  </pic:nvPicPr>
+                  <pic:blipFill>
+                    <a:blip r:embed="rId26">
+                      <a:extLst>
+                        <a:ext uri="{28A0092B-C50C-407E-A947-70E740481C1C}">
+                          <a14:useLocalDpi xmlns:a14="http://schemas.microsoft.com/office/drawing/2010/main" val="0"/>
+                        </a:ext>
+                      </a:extLst>
+                    </a:blip>
+                    <a:srcRect/>
+                    <a:stretch>
+                      <a:fillRect/>
+                    </a:stretch>
+                  </pic:blipFill>
+                  <pic:spPr bwMode="auto">
+                    <a:xfrm>
+                      <a:off x="0" y="0"/>
+                      <a:ext cx="5137150" cy="3105150"/>
+                    </a:xfrm>
+                    <a:prstGeom prst="rect">
+                      <a:avLst/>
+                    </a:prstGeom>
+                    <a:noFill/>
+                    <a:ln>
+                      <a:noFill/>
+                    </a:ln>
+                  </pic:spPr>
+                </pic:pic>
+              </a:graphicData>
+            </a:graphic>
+          </wp:inline>
+        </w:drawing>
+      </w:r>
+    </w:p>
+    <w:p>
+      <w:pPr>
+        <w:pStyle w:val="BodyText"/>
+      </w:pPr>
+      <w:r>
+        <w:rPr>
+          <w:noProof/>
+        </w:rPr>
+        <w:drawing>
+          <wp:inline distT="0" distB="0" distL="0" distR="0" wp14:anchorId="76677427" wp14:editId="30E82773">
+            <wp:extent cx="5941695" cy="2981325"/>
+            <wp:effectExtent l="0" t="0" r="1905" b="9525"/>
+            <wp:docPr id="1169729923" name="Picture 13"/>
+            <wp:cNvGraphicFramePr>
+              <a:graphicFrameLocks xmlns:a="http://schemas.openxmlformats.org/drawingml/2006/main" noChangeAspect="1"/>
+            </wp:cNvGraphicFramePr>
+            <a:graphic xmlns:a="http://schemas.openxmlformats.org/drawingml/2006/main">
+              <a:graphicData uri="http://schemas.openxmlformats.org/drawingml/2006/picture">
+                <pic:pic xmlns:pic="http://schemas.openxmlformats.org/drawingml/2006/picture">
+                  <pic:nvPicPr>
+                    <pic:cNvPr id="0" name="Picture 19"/>
+                    <pic:cNvPicPr>
+                      <a:picLocks noChangeAspect="1" noChangeArrowheads="1"/>
+                    </pic:cNvPicPr>
+                  </pic:nvPicPr>
+                  <pic:blipFill>
+                    <a:blip r:embed="rId27" cstate="print">
+                      <a:extLst>
+                        <a:ext uri="{28A0092B-C50C-407E-A947-70E740481C1C}">
+                          <a14:useLocalDpi xmlns:a14="http://schemas.microsoft.com/office/drawing/2010/main" val="0"/>
+                        </a:ext>
+                      </a:extLst>
+                    </a:blip>
+                    <a:srcRect/>
+                    <a:stretch>
+                      <a:fillRect/>
+                    </a:stretch>
+                  </pic:blipFill>
+                  <pic:spPr bwMode="auto">
+                    <a:xfrm>
+                      <a:off x="0" y="0"/>
+                      <a:ext cx="5941695" cy="2981325"/>
+                    </a:xfrm>
+                    <a:prstGeom prst="rect">
+                      <a:avLst/>
+                    </a:prstGeom>
+                    <a:noFill/>
+                    <a:ln>
+                      <a:noFill/>
+                    </a:ln>
+                  </pic:spPr>
+                </pic:pic>
+              </a:graphicData>
+            </a:graphic>
+          </wp:inline>
+        </w:drawing>
+      </w:r>
     </w:p>
     <w:sectPr>
-      <w:headerReference w:type="default" r:id="rId15"/>
-      <w:footerReference w:type="default" r:id="rId16"/>
-      <w:footerReference w:type="first" r:id="rId17"/>
+      <w:headerReference w:type="default" r:id="rId28"/>
+      <w:footerReference w:type="default" r:id="rId29"/>
+      <w:footerReference w:type="first" r:id="rId30"/>
       <w:pgSz w:w="11909" w:h="16834" w:code="9"/>
       <w:pgMar w:top="1134" w:right="851" w:bottom="1134" w:left="1134" w:header="720" w:footer="720" w:gutter="567"/>
       <w:cols w:space="720"/>
@@ -1483,6 +2531,119 @@
     </w:lvl>
   </w:abstractNum>
   <w:abstractNum w:abstractNumId="2" w15:restartNumberingAfterBreak="0">
+    <w:nsid w:val="0C1C37F2"/>
+    <w:multiLevelType w:val="hybridMultilevel"/>
+    <w:tmpl w:val="EB90B62E"/>
+    <w:lvl w:ilvl="0" w:tplc="04090001">
+      <w:start w:val="1"/>
+      <w:numFmt w:val="bullet"/>
+      <w:lvlText w:val=""/>
+      <w:lvlJc w:val="left"/>
+      <w:pPr>
+        <w:ind w:left="720" w:hanging="360"/>
+      </w:pPr>
+      <w:rPr>
+        <w:rFonts w:ascii="Symbol" w:hAnsi="Symbol" w:hint="default"/>
+      </w:rPr>
+    </w:lvl>
+    <w:lvl w:ilvl="1" w:tplc="04090003" w:tentative="1">
+      <w:start w:val="1"/>
+      <w:numFmt w:val="bullet"/>
+      <w:lvlText w:val="o"/>
+      <w:lvlJc w:val="left"/>
+      <w:pPr>
+        <w:ind w:left="1440" w:hanging="360"/>
+      </w:pPr>
+      <w:rPr>
+        <w:rFonts w:ascii="Courier New" w:hAnsi="Courier New" w:cs="Courier New" w:hint="default"/>
+      </w:rPr>
+    </w:lvl>
+    <w:lvl w:ilvl="2" w:tplc="04090005" w:tentative="1">
+      <w:start w:val="1"/>
+      <w:numFmt w:val="bullet"/>
+      <w:lvlText w:val=""/>
+      <w:lvlJc w:val="left"/>
+      <w:pPr>
+        <w:ind w:left="2160" w:hanging="360"/>
+      </w:pPr>
+      <w:rPr>
+        <w:rFonts w:ascii="Wingdings" w:hAnsi="Wingdings" w:hint="default"/>
+      </w:rPr>
+    </w:lvl>
+    <w:lvl w:ilvl="3" w:tplc="04090001" w:tentative="1">
+      <w:start w:val="1"/>
+      <w:numFmt w:val="bullet"/>
+      <w:lvlText w:val=""/>
+      <w:lvlJc w:val="left"/>
+      <w:pPr>
+        <w:ind w:left="2880" w:hanging="360"/>
+      </w:pPr>
+      <w:rPr>
+        <w:rFonts w:ascii="Symbol" w:hAnsi="Symbol" w:hint="default"/>
+      </w:rPr>
+    </w:lvl>
+    <w:lvl w:ilvl="4" w:tplc="04090003" w:tentative="1">
+      <w:start w:val="1"/>
+      <w:numFmt w:val="bullet"/>
+      <w:lvlText w:val="o"/>
+      <w:lvlJc w:val="left"/>
+      <w:pPr>
+        <w:ind w:left="3600" w:hanging="360"/>
+      </w:pPr>
+      <w:rPr>
+        <w:rFonts w:ascii="Courier New" w:hAnsi="Courier New" w:cs="Courier New" w:hint="default"/>
+      </w:rPr>
+    </w:lvl>
+    <w:lvl w:ilvl="5" w:tplc="04090005" w:tentative="1">
+      <w:start w:val="1"/>
+      <w:numFmt w:val="bullet"/>
+      <w:lvlText w:val=""/>
+      <w:lvlJc w:val="left"/>
+      <w:pPr>
+        <w:ind w:left="4320" w:hanging="360"/>
+      </w:pPr>
+      <w:rPr>
+        <w:rFonts w:ascii="Wingdings" w:hAnsi="Wingdings" w:hint="default"/>
+      </w:rPr>
+    </w:lvl>
+    <w:lvl w:ilvl="6" w:tplc="04090001" w:tentative="1">
+      <w:start w:val="1"/>
+      <w:numFmt w:val="bullet"/>
+      <w:lvlText w:val=""/>
+      <w:lvlJc w:val="left"/>
+      <w:pPr>
+        <w:ind w:left="5040" w:hanging="360"/>
+      </w:pPr>
+      <w:rPr>
+        <w:rFonts w:ascii="Symbol" w:hAnsi="Symbol" w:hint="default"/>
+      </w:rPr>
+    </w:lvl>
+    <w:lvl w:ilvl="7" w:tplc="04090003" w:tentative="1">
+      <w:start w:val="1"/>
+      <w:numFmt w:val="bullet"/>
+      <w:lvlText w:val="o"/>
+      <w:lvlJc w:val="left"/>
+      <w:pPr>
+        <w:ind w:left="5760" w:hanging="360"/>
+      </w:pPr>
+      <w:rPr>
+        <w:rFonts w:ascii="Courier New" w:hAnsi="Courier New" w:cs="Courier New" w:hint="default"/>
+      </w:rPr>
+    </w:lvl>
+    <w:lvl w:ilvl="8" w:tplc="04090005" w:tentative="1">
+      <w:start w:val="1"/>
+      <w:numFmt w:val="bullet"/>
+      <w:lvlText w:val=""/>
+      <w:lvlJc w:val="left"/>
+      <w:pPr>
+        <w:ind w:left="6480" w:hanging="360"/>
+      </w:pPr>
+      <w:rPr>
+        <w:rFonts w:ascii="Wingdings" w:hAnsi="Wingdings" w:hint="default"/>
+      </w:rPr>
+    </w:lvl>
+  </w:abstractNum>
+  <w:abstractNum w:abstractNumId="3" w15:restartNumberingAfterBreak="0">
     <w:nsid w:val="10681414"/>
     <w:multiLevelType w:val="hybridMultilevel"/>
     <w:tmpl w:val="8F8C9382"/>
@@ -1572,7 +2733,7 @@
       </w:pPr>
     </w:lvl>
   </w:abstractNum>
-  <w:abstractNum w:abstractNumId="3" w15:restartNumberingAfterBreak="0">
+  <w:abstractNum w:abstractNumId="4" w15:restartNumberingAfterBreak="0">
     <w:nsid w:val="12B44983"/>
     <w:multiLevelType w:val="multilevel"/>
     <w:tmpl w:val="1436B0F0"/>
@@ -1681,7 +2842,7 @@
       </w:pPr>
     </w:lvl>
   </w:abstractNum>
-  <w:abstractNum w:abstractNumId="4" w15:restartNumberingAfterBreak="0">
+  <w:abstractNum w:abstractNumId="5" w15:restartNumberingAfterBreak="0">
     <w:nsid w:val="1486055B"/>
     <w:multiLevelType w:val="hybridMultilevel"/>
     <w:tmpl w:val="265269DE"/>
@@ -1767,7 +2928,7 @@
       </w:pPr>
     </w:lvl>
   </w:abstractNum>
-  <w:abstractNum w:abstractNumId="5" w15:restartNumberingAfterBreak="0">
+  <w:abstractNum w:abstractNumId="6" w15:restartNumberingAfterBreak="0">
     <w:nsid w:val="15935A1C"/>
     <w:multiLevelType w:val="hybridMultilevel"/>
     <w:tmpl w:val="78BA1E00"/>
@@ -1853,7 +3014,7 @@
       </w:pPr>
     </w:lvl>
   </w:abstractNum>
-  <w:abstractNum w:abstractNumId="6" w15:restartNumberingAfterBreak="0">
+  <w:abstractNum w:abstractNumId="7" w15:restartNumberingAfterBreak="0">
     <w:nsid w:val="195D43B9"/>
     <w:multiLevelType w:val="multilevel"/>
     <w:tmpl w:val="CAD271F8"/>
@@ -1987,7 +3148,120 @@
       </w:rPr>
     </w:lvl>
   </w:abstractNum>
-  <w:abstractNum w:abstractNumId="7" w15:restartNumberingAfterBreak="0">
+  <w:abstractNum w:abstractNumId="8" w15:restartNumberingAfterBreak="0">
+    <w:nsid w:val="1B4E422E"/>
+    <w:multiLevelType w:val="hybridMultilevel"/>
+    <w:tmpl w:val="5312491C"/>
+    <w:lvl w:ilvl="0" w:tplc="04090001">
+      <w:start w:val="1"/>
+      <w:numFmt w:val="bullet"/>
+      <w:lvlText w:val=""/>
+      <w:lvlJc w:val="left"/>
+      <w:pPr>
+        <w:ind w:left="720" w:hanging="360"/>
+      </w:pPr>
+      <w:rPr>
+        <w:rFonts w:ascii="Symbol" w:hAnsi="Symbol" w:hint="default"/>
+      </w:rPr>
+    </w:lvl>
+    <w:lvl w:ilvl="1" w:tplc="04090003" w:tentative="1">
+      <w:start w:val="1"/>
+      <w:numFmt w:val="bullet"/>
+      <w:lvlText w:val="o"/>
+      <w:lvlJc w:val="left"/>
+      <w:pPr>
+        <w:ind w:left="1440" w:hanging="360"/>
+      </w:pPr>
+      <w:rPr>
+        <w:rFonts w:ascii="Courier New" w:hAnsi="Courier New" w:cs="Courier New" w:hint="default"/>
+      </w:rPr>
+    </w:lvl>
+    <w:lvl w:ilvl="2" w:tplc="04090005" w:tentative="1">
+      <w:start w:val="1"/>
+      <w:numFmt w:val="bullet"/>
+      <w:lvlText w:val=""/>
+      <w:lvlJc w:val="left"/>
+      <w:pPr>
+        <w:ind w:left="2160" w:hanging="360"/>
+      </w:pPr>
+      <w:rPr>
+        <w:rFonts w:ascii="Wingdings" w:hAnsi="Wingdings" w:hint="default"/>
+      </w:rPr>
+    </w:lvl>
+    <w:lvl w:ilvl="3" w:tplc="04090001" w:tentative="1">
+      <w:start w:val="1"/>
+      <w:numFmt w:val="bullet"/>
+      <w:lvlText w:val=""/>
+      <w:lvlJc w:val="left"/>
+      <w:pPr>
+        <w:ind w:left="2880" w:hanging="360"/>
+      </w:pPr>
+      <w:rPr>
+        <w:rFonts w:ascii="Symbol" w:hAnsi="Symbol" w:hint="default"/>
+      </w:rPr>
+    </w:lvl>
+    <w:lvl w:ilvl="4" w:tplc="04090003" w:tentative="1">
+      <w:start w:val="1"/>
+      <w:numFmt w:val="bullet"/>
+      <w:lvlText w:val="o"/>
+      <w:lvlJc w:val="left"/>
+      <w:pPr>
+        <w:ind w:left="3600" w:hanging="360"/>
+      </w:pPr>
+      <w:rPr>
+        <w:rFonts w:ascii="Courier New" w:hAnsi="Courier New" w:cs="Courier New" w:hint="default"/>
+      </w:rPr>
+    </w:lvl>
+    <w:lvl w:ilvl="5" w:tplc="04090005" w:tentative="1">
+      <w:start w:val="1"/>
+      <w:numFmt w:val="bullet"/>
+      <w:lvlText w:val=""/>
+      <w:lvlJc w:val="left"/>
+      <w:pPr>
+        <w:ind w:left="4320" w:hanging="360"/>
+      </w:pPr>
+      <w:rPr>
+        <w:rFonts w:ascii="Wingdings" w:hAnsi="Wingdings" w:hint="default"/>
+      </w:rPr>
+    </w:lvl>
+    <w:lvl w:ilvl="6" w:tplc="04090001" w:tentative="1">
+      <w:start w:val="1"/>
+      <w:numFmt w:val="bullet"/>
+      <w:lvlText w:val=""/>
+      <w:lvlJc w:val="left"/>
+      <w:pPr>
+        <w:ind w:left="5040" w:hanging="360"/>
+      </w:pPr>
+      <w:rPr>
+        <w:rFonts w:ascii="Symbol" w:hAnsi="Symbol" w:hint="default"/>
+      </w:rPr>
+    </w:lvl>
+    <w:lvl w:ilvl="7" w:tplc="04090003" w:tentative="1">
+      <w:start w:val="1"/>
+      <w:numFmt w:val="bullet"/>
+      <w:lvlText w:val="o"/>
+      <w:lvlJc w:val="left"/>
+      <w:pPr>
+        <w:ind w:left="5760" w:hanging="360"/>
+      </w:pPr>
+      <w:rPr>
+        <w:rFonts w:ascii="Courier New" w:hAnsi="Courier New" w:cs="Courier New" w:hint="default"/>
+      </w:rPr>
+    </w:lvl>
+    <w:lvl w:ilvl="8" w:tplc="04090005" w:tentative="1">
+      <w:start w:val="1"/>
+      <w:numFmt w:val="bullet"/>
+      <w:lvlText w:val=""/>
+      <w:lvlJc w:val="left"/>
+      <w:pPr>
+        <w:ind w:left="6480" w:hanging="360"/>
+      </w:pPr>
+      <w:rPr>
+        <w:rFonts w:ascii="Wingdings" w:hAnsi="Wingdings" w:hint="default"/>
+      </w:rPr>
+    </w:lvl>
+  </w:abstractNum>
+  <w:abstractNum w:abstractNumId="9" w15:restartNumberingAfterBreak="0">
     <w:nsid w:val="1B7F1C2D"/>
     <w:multiLevelType w:val="hybridMultilevel"/>
     <w:tmpl w:val="50BCA766"/>
@@ -2100,7 +3374,7 @@
       </w:rPr>
     </w:lvl>
   </w:abstractNum>
-  <w:abstractNum w:abstractNumId="8" w15:restartNumberingAfterBreak="0">
+  <w:abstractNum w:abstractNumId="10" w15:restartNumberingAfterBreak="0">
     <w:nsid w:val="1DCB3232"/>
     <w:multiLevelType w:val="hybridMultilevel"/>
     <w:tmpl w:val="B6E86798"/>
@@ -2186,7 +3460,7 @@
       </w:pPr>
     </w:lvl>
   </w:abstractNum>
-  <w:abstractNum w:abstractNumId="9" w15:restartNumberingAfterBreak="0">
+  <w:abstractNum w:abstractNumId="11" w15:restartNumberingAfterBreak="0">
     <w:nsid w:val="26BC42CE"/>
     <w:multiLevelType w:val="hybridMultilevel"/>
     <w:tmpl w:val="F9FCCDCC"/>
@@ -2272,7 +3546,7 @@
       </w:pPr>
     </w:lvl>
   </w:abstractNum>
-  <w:abstractNum w:abstractNumId="10" w15:restartNumberingAfterBreak="0">
+  <w:abstractNum w:abstractNumId="12" w15:restartNumberingAfterBreak="0">
     <w:nsid w:val="2AAA09E6"/>
     <w:multiLevelType w:val="hybridMultilevel"/>
     <w:tmpl w:val="F9FA82D2"/>
@@ -2385,7 +3659,7 @@
       </w:rPr>
     </w:lvl>
   </w:abstractNum>
-  <w:abstractNum w:abstractNumId="11" w15:restartNumberingAfterBreak="0">
+  <w:abstractNum w:abstractNumId="13" w15:restartNumberingAfterBreak="0">
     <w:nsid w:val="34891C95"/>
     <w:multiLevelType w:val="hybridMultilevel"/>
     <w:tmpl w:val="54A6E9EA"/>
@@ -2471,7 +3745,7 @@
       </w:pPr>
     </w:lvl>
   </w:abstractNum>
-  <w:abstractNum w:abstractNumId="12" w15:restartNumberingAfterBreak="0">
+  <w:abstractNum w:abstractNumId="14" w15:restartNumberingAfterBreak="0">
     <w:nsid w:val="37AC0FC9"/>
     <w:multiLevelType w:val="multilevel"/>
     <w:tmpl w:val="7B640D52"/>
@@ -2597,7 +3871,7 @@
       </w:rPr>
     </w:lvl>
   </w:abstractNum>
-  <w:abstractNum w:abstractNumId="13" w15:restartNumberingAfterBreak="0">
+  <w:abstractNum w:abstractNumId="15" w15:restartNumberingAfterBreak="0">
     <w:nsid w:val="383E5E65"/>
     <w:multiLevelType w:val="hybridMultilevel"/>
     <w:tmpl w:val="183ABAB2"/>
@@ -2683,7 +3957,7 @@
       </w:pPr>
     </w:lvl>
   </w:abstractNum>
-  <w:abstractNum w:abstractNumId="14" w15:restartNumberingAfterBreak="0">
+  <w:abstractNum w:abstractNumId="16" w15:restartNumberingAfterBreak="0">
     <w:nsid w:val="38EB53AA"/>
     <w:multiLevelType w:val="hybridMultilevel"/>
     <w:tmpl w:val="13B677BC"/>
@@ -2772,7 +4046,7 @@
       </w:pPr>
     </w:lvl>
   </w:abstractNum>
-  <w:abstractNum w:abstractNumId="15" w15:restartNumberingAfterBreak="0">
+  <w:abstractNum w:abstractNumId="17" w15:restartNumberingAfterBreak="0">
     <w:nsid w:val="3CA65C08"/>
     <w:multiLevelType w:val="hybridMultilevel"/>
     <w:tmpl w:val="C6D0D086"/>
@@ -2885,7 +4159,7 @@
       </w:rPr>
     </w:lvl>
   </w:abstractNum>
-  <w:abstractNum w:abstractNumId="16" w15:restartNumberingAfterBreak="0">
+  <w:abstractNum w:abstractNumId="18" w15:restartNumberingAfterBreak="0">
     <w:nsid w:val="3D9A0832"/>
     <w:multiLevelType w:val="hybridMultilevel"/>
     <w:tmpl w:val="2034C840"/>
@@ -2971,7 +4245,7 @@
       </w:pPr>
     </w:lvl>
   </w:abstractNum>
-  <w:abstractNum w:abstractNumId="17" w15:restartNumberingAfterBreak="0">
+  <w:abstractNum w:abstractNumId="19" w15:restartNumberingAfterBreak="0">
     <w:nsid w:val="3EF165C7"/>
     <w:multiLevelType w:val="hybridMultilevel"/>
     <w:tmpl w:val="0CEAE8EE"/>
@@ -3060,7 +4334,7 @@
       </w:pPr>
     </w:lvl>
   </w:abstractNum>
-  <w:abstractNum w:abstractNumId="18" w15:restartNumberingAfterBreak="0">
+  <w:abstractNum w:abstractNumId="20" w15:restartNumberingAfterBreak="0">
     <w:nsid w:val="41650613"/>
     <w:multiLevelType w:val="hybridMultilevel"/>
     <w:tmpl w:val="B986F222"/>
@@ -3173,7 +4447,7 @@
       </w:rPr>
     </w:lvl>
   </w:abstractNum>
-  <w:abstractNum w:abstractNumId="19" w15:restartNumberingAfterBreak="0">
+  <w:abstractNum w:abstractNumId="21" w15:restartNumberingAfterBreak="0">
     <w:nsid w:val="41FA5B0F"/>
     <w:multiLevelType w:val="hybridMultilevel"/>
     <w:tmpl w:val="B5006B38"/>
@@ -3262,7 +4536,120 @@
       </w:pPr>
     </w:lvl>
   </w:abstractNum>
-  <w:abstractNum w:abstractNumId="20" w15:restartNumberingAfterBreak="0">
+  <w:abstractNum w:abstractNumId="22" w15:restartNumberingAfterBreak="0">
+    <w:nsid w:val="4682337C"/>
+    <w:multiLevelType w:val="hybridMultilevel"/>
+    <w:tmpl w:val="D77EC014"/>
+    <w:lvl w:ilvl="0" w:tplc="04090001">
+      <w:start w:val="1"/>
+      <w:numFmt w:val="bullet"/>
+      <w:lvlText w:val=""/>
+      <w:lvlJc w:val="left"/>
+      <w:pPr>
+        <w:ind w:left="720" w:hanging="360"/>
+      </w:pPr>
+      <w:rPr>
+        <w:rFonts w:ascii="Symbol" w:hAnsi="Symbol" w:hint="default"/>
+      </w:rPr>
+    </w:lvl>
+    <w:lvl w:ilvl="1" w:tplc="04090003" w:tentative="1">
+      <w:start w:val="1"/>
+      <w:numFmt w:val="bullet"/>
+      <w:lvlText w:val="o"/>
+      <w:lvlJc w:val="left"/>
+      <w:pPr>
+        <w:ind w:left="1440" w:hanging="360"/>
+      </w:pPr>
+      <w:rPr>
+        <w:rFonts w:ascii="Courier New" w:hAnsi="Courier New" w:cs="Courier New" w:hint="default"/>
+      </w:rPr>
+    </w:lvl>
+    <w:lvl w:ilvl="2" w:tplc="04090005" w:tentative="1">
+      <w:start w:val="1"/>
+      <w:numFmt w:val="bullet"/>
+      <w:lvlText w:val=""/>
+      <w:lvlJc w:val="left"/>
+      <w:pPr>
+        <w:ind w:left="2160" w:hanging="360"/>
+      </w:pPr>
+      <w:rPr>
+        <w:rFonts w:ascii="Wingdings" w:hAnsi="Wingdings" w:hint="default"/>
+      </w:rPr>
+    </w:lvl>
+    <w:lvl w:ilvl="3" w:tplc="04090001" w:tentative="1">
+      <w:start w:val="1"/>
+      <w:numFmt w:val="bullet"/>
+      <w:lvlText w:val=""/>
+      <w:lvlJc w:val="left"/>
+      <w:pPr>
+        <w:ind w:left="2880" w:hanging="360"/>
+      </w:pPr>
+      <w:rPr>
+        <w:rFonts w:ascii="Symbol" w:hAnsi="Symbol" w:hint="default"/>
+      </w:rPr>
+    </w:lvl>
+    <w:lvl w:ilvl="4" w:tplc="04090003" w:tentative="1">
+      <w:start w:val="1"/>
+      <w:numFmt w:val="bullet"/>
+      <w:lvlText w:val="o"/>
+      <w:lvlJc w:val="left"/>
+      <w:pPr>
+        <w:ind w:left="3600" w:hanging="360"/>
+      </w:pPr>
+      <w:rPr>
+        <w:rFonts w:ascii="Courier New" w:hAnsi="Courier New" w:cs="Courier New" w:hint="default"/>
+      </w:rPr>
+    </w:lvl>
+    <w:lvl w:ilvl="5" w:tplc="04090005" w:tentative="1">
+      <w:start w:val="1"/>
+      <w:numFmt w:val="bullet"/>
+      <w:lvlText w:val=""/>
+      <w:lvlJc w:val="left"/>
+      <w:pPr>
+        <w:ind w:left="4320" w:hanging="360"/>
+      </w:pPr>
+      <w:rPr>
+        <w:rFonts w:ascii="Wingdings" w:hAnsi="Wingdings" w:hint="default"/>
+      </w:rPr>
+    </w:lvl>
+    <w:lvl w:ilvl="6" w:tplc="04090001" w:tentative="1">
+      <w:start w:val="1"/>
+      <w:numFmt w:val="bullet"/>
+      <w:lvlText w:val=""/>
+      <w:lvlJc w:val="left"/>
+      <w:pPr>
+        <w:ind w:left="5040" w:hanging="360"/>
+      </w:pPr>
+      <w:rPr>
+        <w:rFonts w:ascii="Symbol" w:hAnsi="Symbol" w:hint="default"/>
+      </w:rPr>
+    </w:lvl>
+    <w:lvl w:ilvl="7" w:tplc="04090003" w:tentative="1">
+      <w:start w:val="1"/>
+      <w:numFmt w:val="bullet"/>
+      <w:lvlText w:val="o"/>
+      <w:lvlJc w:val="left"/>
+      <w:pPr>
+        <w:ind w:left="5760" w:hanging="360"/>
+      </w:pPr>
+      <w:rPr>
+        <w:rFonts w:ascii="Courier New" w:hAnsi="Courier New" w:cs="Courier New" w:hint="default"/>
+      </w:rPr>
+    </w:lvl>
+    <w:lvl w:ilvl="8" w:tplc="04090005" w:tentative="1">
+      <w:start w:val="1"/>
+      <w:numFmt w:val="bullet"/>
+      <w:lvlText w:val=""/>
+      <w:lvlJc w:val="left"/>
+      <w:pPr>
+        <w:ind w:left="6480" w:hanging="360"/>
+      </w:pPr>
+      <w:rPr>
+        <w:rFonts w:ascii="Wingdings" w:hAnsi="Wingdings" w:hint="default"/>
+      </w:rPr>
+    </w:lvl>
+  </w:abstractNum>
+  <w:abstractNum w:abstractNumId="23" w15:restartNumberingAfterBreak="0">
     <w:nsid w:val="49D94395"/>
     <w:multiLevelType w:val="hybridMultilevel"/>
     <w:tmpl w:val="B5006B38"/>
@@ -3351,7 +4738,7 @@
       </w:pPr>
     </w:lvl>
   </w:abstractNum>
-  <w:abstractNum w:abstractNumId="21" w15:restartNumberingAfterBreak="0">
+  <w:abstractNum w:abstractNumId="24" w15:restartNumberingAfterBreak="0">
     <w:nsid w:val="4B4C631E"/>
     <w:multiLevelType w:val="hybridMultilevel"/>
     <w:tmpl w:val="A31AD024"/>
@@ -3437,7 +4824,7 @@
       </w:pPr>
     </w:lvl>
   </w:abstractNum>
-  <w:abstractNum w:abstractNumId="22" w15:restartNumberingAfterBreak="0">
+  <w:abstractNum w:abstractNumId="25" w15:restartNumberingAfterBreak="0">
     <w:nsid w:val="50157466"/>
     <w:multiLevelType w:val="multilevel"/>
     <w:tmpl w:val="04090023"/>
@@ -3552,7 +4939,7 @@
       </w:pPr>
     </w:lvl>
   </w:abstractNum>
-  <w:abstractNum w:abstractNumId="23" w15:restartNumberingAfterBreak="0">
+  <w:abstractNum w:abstractNumId="26" w15:restartNumberingAfterBreak="0">
     <w:nsid w:val="58155A8A"/>
     <w:multiLevelType w:val="multilevel"/>
     <w:tmpl w:val="EE7A7A12"/>
@@ -3654,7 +5041,7 @@
       </w:pPr>
     </w:lvl>
   </w:abstractNum>
-  <w:abstractNum w:abstractNumId="24" w15:restartNumberingAfterBreak="0">
+  <w:abstractNum w:abstractNumId="27" w15:restartNumberingAfterBreak="0">
     <w:nsid w:val="5AF36BA0"/>
     <w:multiLevelType w:val="hybridMultilevel"/>
     <w:tmpl w:val="58982436"/>
@@ -3766,7 +5153,7 @@
       </w:rPr>
     </w:lvl>
   </w:abstractNum>
-  <w:abstractNum w:abstractNumId="25" w15:restartNumberingAfterBreak="0">
+  <w:abstractNum w:abstractNumId="28" w15:restartNumberingAfterBreak="0">
     <w:nsid w:val="633C43E4"/>
     <w:multiLevelType w:val="hybridMultilevel"/>
     <w:tmpl w:val="AC76DB78"/>
@@ -3879,7 +5266,7 @@
       </w:rPr>
     </w:lvl>
   </w:abstractNum>
-  <w:abstractNum w:abstractNumId="26" w15:restartNumberingAfterBreak="0">
+  <w:abstractNum w:abstractNumId="29" w15:restartNumberingAfterBreak="0">
     <w:nsid w:val="6DB2106C"/>
     <w:multiLevelType w:val="hybridMultilevel"/>
     <w:tmpl w:val="33026470"/>
@@ -4020,7 +5407,7 @@
       </w:rPr>
     </w:lvl>
   </w:abstractNum>
-  <w:abstractNum w:abstractNumId="27" w15:restartNumberingAfterBreak="0">
+  <w:abstractNum w:abstractNumId="30" w15:restartNumberingAfterBreak="0">
     <w:nsid w:val="7EC52D75"/>
     <w:multiLevelType w:val="hybridMultilevel"/>
     <w:tmpl w:val="0CEAE8EE"/>
@@ -4110,19 +5497,19 @@
     </w:lvl>
   </w:abstractNum>
   <w:num w:numId="1" w16cid:durableId="829754107">
-    <w:abstractNumId w:val="6"/>
+    <w:abstractNumId w:val="7"/>
   </w:num>
   <w:num w:numId="2" w16cid:durableId="313800265">
-    <w:abstractNumId w:val="23"/>
+    <w:abstractNumId w:val="26"/>
   </w:num>
   <w:num w:numId="3" w16cid:durableId="140661609">
+    <w:abstractNumId w:val="4"/>
+  </w:num>
+  <w:num w:numId="4" w16cid:durableId="327245535">
     <w:abstractNumId w:val="3"/>
   </w:num>
-  <w:num w:numId="4" w16cid:durableId="327245535">
-    <w:abstractNumId w:val="2"/>
-  </w:num>
   <w:num w:numId="5" w16cid:durableId="949360936">
-    <w:abstractNumId w:val="22"/>
+    <w:abstractNumId w:val="25"/>
   </w:num>
   <w:num w:numId="6" w16cid:durableId="1604074965">
     <w:abstractNumId w:val="0"/>
@@ -4155,10 +5542,10 @@
     </w:lvlOverride>
   </w:num>
   <w:num w:numId="7" w16cid:durableId="1006788273">
-    <w:abstractNumId w:val="27"/>
+    <w:abstractNumId w:val="30"/>
   </w:num>
   <w:num w:numId="8" w16cid:durableId="1860390701">
-    <w:abstractNumId w:val="20"/>
+    <w:abstractNumId w:val="23"/>
     <w:lvlOverride w:ilvl="0">
       <w:startOverride w:val="1"/>
     </w:lvlOverride>
@@ -4188,76 +5575,76 @@
     </w:lvlOverride>
   </w:num>
   <w:num w:numId="9" w16cid:durableId="337388957">
-    <w:abstractNumId w:val="12"/>
+    <w:abstractNumId w:val="14"/>
   </w:num>
   <w:num w:numId="10" w16cid:durableId="1520387170">
-    <w:abstractNumId w:val="9"/>
+    <w:abstractNumId w:val="11"/>
   </w:num>
   <w:num w:numId="11" w16cid:durableId="72357837">
-    <w:abstractNumId w:val="8"/>
+    <w:abstractNumId w:val="10"/>
   </w:num>
   <w:num w:numId="12" w16cid:durableId="1760369271">
-    <w:abstractNumId w:val="11"/>
+    <w:abstractNumId w:val="13"/>
   </w:num>
   <w:num w:numId="13" w16cid:durableId="1852521814">
     <w:abstractNumId w:val="1"/>
   </w:num>
   <w:num w:numId="14" w16cid:durableId="75053201">
-    <w:abstractNumId w:val="10"/>
+    <w:abstractNumId w:val="12"/>
   </w:num>
   <w:num w:numId="15" w16cid:durableId="1273435228">
+    <w:abstractNumId w:val="20"/>
+  </w:num>
+  <w:num w:numId="16" w16cid:durableId="1519927598">
+    <w:abstractNumId w:val="15"/>
+  </w:num>
+  <w:num w:numId="17" w16cid:durableId="294067833">
+    <w:abstractNumId w:val="6"/>
+  </w:num>
+  <w:num w:numId="18" w16cid:durableId="1335498291">
+    <w:abstractNumId w:val="5"/>
+  </w:num>
+  <w:num w:numId="19" w16cid:durableId="1437556242">
+    <w:abstractNumId w:val="24"/>
+  </w:num>
+  <w:num w:numId="20" w16cid:durableId="853035768">
     <w:abstractNumId w:val="18"/>
   </w:num>
-  <w:num w:numId="16" w16cid:durableId="1519927598">
-    <w:abstractNumId w:val="13"/>
+  <w:num w:numId="21" w16cid:durableId="1786340477">
+    <w:abstractNumId w:val="17"/>
   </w:num>
-  <w:num w:numId="17" w16cid:durableId="294067833">
-    <w:abstractNumId w:val="5"/>
+  <w:num w:numId="22" w16cid:durableId="481656171">
+    <w:abstractNumId w:val="28"/>
   </w:num>
-  <w:num w:numId="18" w16cid:durableId="1335498291">
-    <w:abstractNumId w:val="4"/>
+  <w:num w:numId="23" w16cid:durableId="1744521237">
+    <w:abstractNumId w:val="29"/>
   </w:num>
-  <w:num w:numId="19" w16cid:durableId="1437556242">
+  <w:num w:numId="24" w16cid:durableId="1191800910">
+    <w:abstractNumId w:val="9"/>
+  </w:num>
+  <w:num w:numId="25" w16cid:durableId="504824680">
+    <w:abstractNumId w:val="3"/>
+  </w:num>
+  <w:num w:numId="26" w16cid:durableId="262885617">
     <w:abstractNumId w:val="21"/>
   </w:num>
-  <w:num w:numId="20" w16cid:durableId="853035768">
-    <w:abstractNumId w:val="16"/>
-  </w:num>
-  <w:num w:numId="21" w16cid:durableId="1786340477">
-    <w:abstractNumId w:val="15"/>
-  </w:num>
-  <w:num w:numId="22" w16cid:durableId="481656171">
-    <w:abstractNumId w:val="25"/>
-  </w:num>
-  <w:num w:numId="23" w16cid:durableId="1744521237">
-    <w:abstractNumId w:val="26"/>
-  </w:num>
-  <w:num w:numId="24" w16cid:durableId="1191800910">
+  <w:num w:numId="27" w16cid:durableId="2090467959">
     <w:abstractNumId w:val="7"/>
   </w:num>
-  <w:num w:numId="25" w16cid:durableId="504824680">
-    <w:abstractNumId w:val="2"/>
-  </w:num>
-  <w:num w:numId="26" w16cid:durableId="262885617">
-    <w:abstractNumId w:val="19"/>
-  </w:num>
-  <w:num w:numId="27" w16cid:durableId="2090467959">
-    <w:abstractNumId w:val="6"/>
-  </w:num>
   <w:num w:numId="28" w16cid:durableId="849375740">
-    <w:abstractNumId w:val="6"/>
+    <w:abstractNumId w:val="7"/>
   </w:num>
   <w:num w:numId="29" w16cid:durableId="4669902">
-    <w:abstractNumId w:val="6"/>
+    <w:abstractNumId w:val="7"/>
   </w:num>
   <w:num w:numId="30" w16cid:durableId="315915501">
-    <w:abstractNumId w:val="6"/>
+    <w:abstractNumId w:val="7"/>
   </w:num>
   <w:num w:numId="31" w16cid:durableId="935090120">
-    <w:abstractNumId w:val="24"/>
+    <w:abstractNumId w:val="27"/>
   </w:num>
   <w:num w:numId="32" w16cid:durableId="879052551">
-    <w:abstractNumId w:val="27"/>
+    <w:abstractNumId w:val="30"/>
     <w:lvlOverride w:ilvl="0">
       <w:startOverride w:val="1"/>
     </w:lvlOverride>
@@ -4287,13 +5674,22 @@
     </w:lvlOverride>
   </w:num>
   <w:num w:numId="33" w16cid:durableId="1277716790">
-    <w:abstractNumId w:val="17"/>
+    <w:abstractNumId w:val="19"/>
   </w:num>
   <w:num w:numId="34" w16cid:durableId="948975095">
-    <w:abstractNumId w:val="6"/>
+    <w:abstractNumId w:val="7"/>
   </w:num>
   <w:num w:numId="35" w16cid:durableId="225838951">
-    <w:abstractNumId w:val="14"/>
+    <w:abstractNumId w:val="16"/>
+  </w:num>
+  <w:num w:numId="36" w16cid:durableId="349917536">
+    <w:abstractNumId w:val="8"/>
+  </w:num>
+  <w:num w:numId="37" w16cid:durableId="1382051156">
+    <w:abstractNumId w:val="2"/>
+  </w:num>
+  <w:num w:numId="38" w16cid:durableId="1155292631">
+    <w:abstractNumId w:val="22"/>
   </w:num>
   <w:numIdMacAtCleanup w:val="22"/>
 </w:numbering>

</xml_diff>